<commit_message>
docs(reports): close Sprint 3 row in status report — Stage A + Stage B both PASS
Sprint 3 history row moves from "in progress" → "closed 2026-05-14".
Window updated to 2026-05-13 → 2026-05-14 (single 36-hour cycle:
ship → Stage A 9/9 → Stage B 10/10 → first real Dispatch live).

Adds the Stage B summary inline + lists the 7 follow-up fixes that
landed mid-flight (3 in Stage A, 4 in Stage B). Adds Sprint 4.5
(theme + tags) and Sprint 5.5 (subscribe-nudges) to the deferred
items list, linking to the roadmap doc.

Sign-off table updated: Tarry Singh ✓ Stage B (2026-05-14) ·
Claude ✓ Stage A (2026-05-13).

One pending Tarry-side housekeeping item carried forward:
clear STUDIO_AI_DEBUG=1 from the Vercel project. Diagnostic-only
flag from Stage A — no longer needed.

Co-Authored-By: Claude Opus 4.7 (1M context) <noreply@anthropic.com>
</commit_message>
<xml_diff>
--- a/docs/reports/dispatches-status-report.docx
+++ b/docs/reports/dispatches-status-report.docx
@@ -61,7 +61,25 @@
           <w:sz w:val="22"/>
           <w:szCs w:val="22"/>
         </w:rPr>
-        <w:t xml:space="preserve"> 2026-05-13 (Sprint 3 Stage A UAT PASS 9/9 · Stage B pending Tarry-side in-browser run · Sprint 2 closed earlier the same day) </w:t>
+        <w:t xml:space="preserve"> 2026-05-14 (Sprint 3 closed — Stage A 9/9 PASS · Stage B 10/10 PASS · first real Dispatch live at </w:t>
+      </w:r>
+      <w:r>
+        <w:rPr>
+          <w:rFonts w:ascii="Menlo" w:cs="Menlo" w:eastAsia="Menlo" w:hAnsi="Menlo"/>
+          <w:color w:val="B45309"/>
+          <w:sz w:val="20"/>
+          <w:szCs w:val="20"/>
+        </w:rPr>
+        <w:t xml:space="preserve">/blog/four-weeks-that-bent-the-ai-arc</w:t>
+      </w:r>
+      <w:r>
+        <w:rPr>
+          <w:rFonts w:ascii="Georgia" w:cs="Georgia" w:eastAsia="Georgia" w:hAnsi="Georgia"/>
+          <w:color w:val="0F172A"/>
+          <w:sz w:val="22"/>
+          <w:szCs w:val="22"/>
+        </w:rPr>
+        <w:t xml:space="preserve">) </w:t>
       </w:r>
       <w:r>
         <w:rPr>
@@ -103,7 +121,7 @@
         </w:rPr>
         <w:t xml:space="preserve"> </w:t>
       </w:r>
-      <w:hyperlink w:history="1" r:id="rIdgyc1_ccbvb1zqywhbecdh">
+      <w:hyperlink w:history="1" r:id="rIdpfli7dxytvlfntgowujq3">
         <w:r>
           <w:rPr>
             <w:rFonts w:ascii="Georgia" w:cs="Georgia" w:eastAsia="Georgia" w:hAnsi="Georgia"/>
@@ -1870,7 +1888,7 @@
           <w:sz w:val="26"/>
           <w:szCs w:val="26"/>
         </w:rPr>
-        <w:t xml:space="preserve">Sprint 3 — Studio Editor (in progress)</w:t>
+        <w:t xml:space="preserve">Sprint 3 — Studio Editor (closed 2026-05-14)</w:t>
       </w:r>
     </w:p>
     <w:p>
@@ -1895,7 +1913,7 @@
           <w:sz w:val="22"/>
           <w:szCs w:val="22"/>
         </w:rPr>
-        <w:t xml:space="preserve"> 2026-05-13 → TBD </w:t>
+        <w:t xml:space="preserve"> 2026-05-13 → 2026-05-14 (single 36-hour cycle: ship → Stage A 9/9 → Stage B 10/10 → first real Dispatch live) </w:t>
       </w:r>
       <w:r>
         <w:rPr>
@@ -1933,7 +1951,25 @@
           <w:sz w:val="22"/>
           <w:szCs w:val="22"/>
         </w:rPr>
-        <w:t xml:space="preserve"> so Tarry can write a Dispatch in a browser, ask Claude Opus 4.7-extended-thinking (4K tokens) for help on Continue + Rewrite, and Publish straight to </w:t>
+        <w:t xml:space="preserve"> so Tarry can write a Dispatch in a browser, ask Claude Opus extended-thinking (</w:t>
+      </w:r>
+      <w:r>
+        <w:rPr>
+          <w:rFonts w:ascii="Menlo" w:cs="Menlo" w:eastAsia="Menlo" w:hAnsi="Menlo"/>
+          <w:color w:val="B45309"/>
+          <w:sz w:val="20"/>
+          <w:szCs w:val="20"/>
+        </w:rPr>
+        <w:t xml:space="preserve">claude-opus-4-6</w:t>
+      </w:r>
+      <w:r>
+        <w:rPr>
+          <w:rFonts w:ascii="Georgia" w:cs="Georgia" w:eastAsia="Georgia" w:hAnsi="Georgia"/>
+          <w:color w:val="0F172A"/>
+          <w:sz w:val="22"/>
+          <w:szCs w:val="22"/>
+        </w:rPr>
+        <w:t xml:space="preserve"> · 4K thinking tokens) for help on Continue + Rewrite, and Publish straight to </w:t>
       </w:r>
       <w:r>
         <w:rPr>
@@ -2821,106 +2857,66 @@
           <w:sz w:val="22"/>
           <w:szCs w:val="22"/>
         </w:rPr>
-        <w:t xml:space="preserve">Live state (2026-05-13):</w:t>
-      </w:r>
-      <w:r>
-        <w:rPr>
-          <w:rFonts w:ascii="Georgia" w:cs="Georgia" w:eastAsia="Georgia" w:hAnsi="Georgia"/>
-          <w:color w:val="0F172A"/>
-          <w:sz w:val="22"/>
-          <w:szCs w:val="22"/>
-        </w:rPr>
-        <w:t xml:space="preserve"> code shipped; env vars set on Vercel (</w:t>
-      </w:r>
-      <w:r>
-        <w:rPr>
-          <w:rFonts w:ascii="Menlo" w:cs="Menlo" w:eastAsia="Menlo" w:hAnsi="Menlo"/>
-          <w:color w:val="B45309"/>
-          <w:sz w:val="20"/>
-          <w:szCs w:val="20"/>
-        </w:rPr>
-        <w:t xml:space="preserve">STUDIO_USER</w:t>
-      </w:r>
-      <w:r>
-        <w:rPr>
-          <w:rFonts w:ascii="Georgia" w:cs="Georgia" w:eastAsia="Georgia" w:hAnsi="Georgia"/>
-          <w:color w:val="0F172A"/>
-          <w:sz w:val="22"/>
-          <w:szCs w:val="22"/>
-        </w:rPr>
-        <w:t xml:space="preserve">, </w:t>
-      </w:r>
-      <w:r>
-        <w:rPr>
-          <w:rFonts w:ascii="Menlo" w:cs="Menlo" w:eastAsia="Menlo" w:hAnsi="Menlo"/>
-          <w:color w:val="B45309"/>
-          <w:sz w:val="20"/>
-          <w:szCs w:val="20"/>
-        </w:rPr>
-        <w:t xml:space="preserve">STUDIO_PASS</w:t>
-      </w:r>
-      <w:r>
-        <w:rPr>
-          <w:rFonts w:ascii="Georgia" w:cs="Georgia" w:eastAsia="Georgia" w:hAnsi="Georgia"/>
-          <w:color w:val="0F172A"/>
-          <w:sz w:val="22"/>
-          <w:szCs w:val="22"/>
-        </w:rPr>
-        <w:t xml:space="preserve">, </w:t>
-      </w:r>
-      <w:r>
-        <w:rPr>
-          <w:rFonts w:ascii="Menlo" w:cs="Menlo" w:eastAsia="Menlo" w:hAnsi="Menlo"/>
-          <w:color w:val="B45309"/>
-          <w:sz w:val="20"/>
-          <w:szCs w:val="20"/>
-        </w:rPr>
-        <w:t xml:space="preserve">STUDIO_GITHUB_TOKEN</w:t>
-      </w:r>
-      <w:r>
-        <w:rPr>
-          <w:rFonts w:ascii="Georgia" w:cs="Georgia" w:eastAsia="Georgia" w:hAnsi="Georgia"/>
-          <w:color w:val="0F172A"/>
-          <w:sz w:val="22"/>
-          <w:szCs w:val="22"/>
-        </w:rPr>
-        <w:t xml:space="preserve">, </w:t>
-      </w:r>
-      <w:r>
-        <w:rPr>
-          <w:rFonts w:ascii="Menlo" w:cs="Menlo" w:eastAsia="Menlo" w:hAnsi="Menlo"/>
-          <w:color w:val="B45309"/>
-          <w:sz w:val="20"/>
-          <w:szCs w:val="20"/>
-        </w:rPr>
-        <w:t xml:space="preserve">ANTHROPIC_API_KEY</w:t>
-      </w:r>
-      <w:r>
-        <w:rPr>
-          <w:rFonts w:ascii="Georgia" w:cs="Georgia" w:eastAsia="Georgia" w:hAnsi="Georgia"/>
-          <w:color w:val="0F172A"/>
-          <w:sz w:val="22"/>
-          <w:szCs w:val="22"/>
-        </w:rPr>
-        <w:t xml:space="preserve">, </w:t>
-      </w:r>
-      <w:r>
-        <w:rPr>
-          <w:rFonts w:ascii="Menlo" w:cs="Menlo" w:eastAsia="Menlo" w:hAnsi="Menlo"/>
-          <w:color w:val="B45309"/>
-          <w:sz w:val="20"/>
-          <w:szCs w:val="20"/>
-        </w:rPr>
-        <w:t xml:space="preserve">STUDIO_AI_MODEL=claude-opus-4-6</w:t>
-      </w:r>
-      <w:r>
-        <w:rPr>
-          <w:rFonts w:ascii="Georgia" w:cs="Georgia" w:eastAsia="Georgia" w:hAnsi="Georgia"/>
-          <w:color w:val="0F172A"/>
-          <w:sz w:val="22"/>
-          <w:szCs w:val="22"/>
-        </w:rPr>
-        <w:t xml:space="preserve">, </w:t>
+        <w:t xml:space="preserve">Live state (2026-05-14, closed):</w:t>
+      </w:r>
+      <w:r>
+        <w:rPr>
+          <w:rFonts w:ascii="Georgia" w:cs="Georgia" w:eastAsia="Georgia" w:hAnsi="Georgia"/>
+          <w:color w:val="0F172A"/>
+          <w:sz w:val="22"/>
+          <w:szCs w:val="22"/>
+        </w:rPr>
+        <w:t xml:space="preserve"> code shipped + UAT-tested + first real Dispatch published end-to-end.</w:t>
+      </w:r>
+    </w:p>
+    <w:p>
+      <w:pPr>
+        <w:pStyle w:val="ListParagraph"/>
+        <w:numPr>
+          <w:ilvl w:val="0"/>
+          <w:numId w:val="2"/>
+        </w:numPr>
+        <w:spacing w:after="80" w:line="300"/>
+      </w:pPr>
+      <w:r>
+        <w:rPr>
+          <w:rFonts w:ascii="Georgia" w:cs="Georgia" w:eastAsia="Georgia" w:hAnsi="Georgia"/>
+          <w:b/>
+          <w:bCs/>
+          <w:color w:val="0F172A"/>
+          <w:sz w:val="22"/>
+          <w:szCs w:val="22"/>
+        </w:rPr>
+        <w:t xml:space="preserve">Stage A (wire-level, Claude):</w:t>
+      </w:r>
+      <w:r>
+        <w:rPr>
+          <w:rFonts w:ascii="Georgia" w:cs="Georgia" w:eastAsia="Georgia" w:hAnsi="Georgia"/>
+          <w:color w:val="0F172A"/>
+          <w:sz w:val="22"/>
+          <w:szCs w:val="22"/>
+        </w:rPr>
+        <w:t xml:space="preserve"> </w:t>
+      </w:r>
+      <w:r>
+        <w:rPr>
+          <w:rFonts w:ascii="Georgia" w:cs="Georgia" w:eastAsia="Georgia" w:hAnsi="Georgia"/>
+          <w:b/>
+          <w:bCs/>
+          <w:color w:val="0F172A"/>
+          <w:sz w:val="22"/>
+          <w:szCs w:val="22"/>
+        </w:rPr>
+        <w:t xml:space="preserve">9/9 PASS</w:t>
+      </w:r>
+      <w:r>
+        <w:rPr>
+          <w:rFonts w:ascii="Georgia" w:cs="Georgia" w:eastAsia="Georgia" w:hAnsi="Georgia"/>
+          <w:color w:val="0F172A"/>
+          <w:sz w:val="22"/>
+          <w:szCs w:val="22"/>
+        </w:rPr>
+        <w:t xml:space="preserve"> 2026-05-13. Three follow-up issues caught + fixed mid-flight — bogus default model id (PR #7), Vercel runtime log truncation hiding the real Anthropic error (PR #8 added </w:t>
       </w:r>
       <w:r>
         <w:rPr>
@@ -2930,6 +2926,122 @@
           <w:szCs w:val="20"/>
         </w:rPr>
         <w:t xml:space="preserve">STUDIO_AI_DEBUG=1</w:t>
+      </w:r>
+      <w:r>
+        <w:rPr>
+          <w:rFonts w:ascii="Georgia" w:cs="Georgia" w:eastAsia="Georgia" w:hAnsi="Georgia"/>
+          <w:color w:val="0F172A"/>
+          <w:sz w:val="22"/>
+          <w:szCs w:val="22"/>
+        </w:rPr>
+        <w:t xml:space="preserve">), pre-rotation API key (filed runbook at </w:t>
+      </w:r>
+      <w:r>
+        <w:rPr>
+          <w:rFonts w:ascii="Menlo" w:cs="Menlo" w:eastAsia="Menlo" w:hAnsi="Menlo"/>
+          <w:color w:val="B45309"/>
+          <w:sz w:val="20"/>
+          <w:szCs w:val="20"/>
+        </w:rPr>
+        <w:t xml:space="preserve">docs/runbooks/api-key-rotation.md</w:t>
+      </w:r>
+      <w:r>
+        <w:rPr>
+          <w:rFonts w:ascii="Georgia" w:cs="Georgia" w:eastAsia="Georgia" w:hAnsi="Georgia"/>
+          <w:color w:val="0F172A"/>
+          <w:sz w:val="22"/>
+          <w:szCs w:val="22"/>
+        </w:rPr>
+        <w:t xml:space="preserve">).</w:t>
+      </w:r>
+    </w:p>
+    <w:p>
+      <w:pPr>
+        <w:pStyle w:val="ListParagraph"/>
+        <w:numPr>
+          <w:ilvl w:val="0"/>
+          <w:numId w:val="2"/>
+        </w:numPr>
+        <w:spacing w:after="80" w:line="300"/>
+      </w:pPr>
+      <w:r>
+        <w:rPr>
+          <w:rFonts w:ascii="Georgia" w:cs="Georgia" w:eastAsia="Georgia" w:hAnsi="Georgia"/>
+          <w:b/>
+          <w:bCs/>
+          <w:color w:val="0F172A"/>
+          <w:sz w:val="22"/>
+          <w:szCs w:val="22"/>
+        </w:rPr>
+        <w:t xml:space="preserve">Stage B (in-browser, Tarry):</w:t>
+      </w:r>
+      <w:r>
+        <w:rPr>
+          <w:rFonts w:ascii="Georgia" w:cs="Georgia" w:eastAsia="Georgia" w:hAnsi="Georgia"/>
+          <w:color w:val="0F172A"/>
+          <w:sz w:val="22"/>
+          <w:szCs w:val="22"/>
+        </w:rPr>
+        <w:t xml:space="preserve"> </w:t>
+      </w:r>
+      <w:r>
+        <w:rPr>
+          <w:rFonts w:ascii="Georgia" w:cs="Georgia" w:eastAsia="Georgia" w:hAnsi="Georgia"/>
+          <w:b/>
+          <w:bCs/>
+          <w:color w:val="0F172A"/>
+          <w:sz w:val="22"/>
+          <w:szCs w:val="22"/>
+        </w:rPr>
+        <w:t xml:space="preserve">10/10 PASS</w:t>
+      </w:r>
+      <w:r>
+        <w:rPr>
+          <w:rFonts w:ascii="Georgia" w:cs="Georgia" w:eastAsia="Georgia" w:hAnsi="Georgia"/>
+          <w:color w:val="0F172A"/>
+          <w:sz w:val="22"/>
+          <w:szCs w:val="22"/>
+        </w:rPr>
+        <w:t xml:space="preserve"> 2026-05-14. Four more follow-up issues caught + fixed mid-flight — aspirational UI label dropped (PR #11), autosave stale-closure (PR #12), autosave-on-mount overwrote a 387-word draft (PR #13 critical), no trash button on draft cards (PR #14). Every fix carries a </w:t>
+      </w:r>
+      <w:r>
+        <w:rPr>
+          <w:rFonts w:ascii="Menlo" w:cs="Menlo" w:eastAsia="Menlo" w:hAnsi="Menlo"/>
+          <w:color w:val="B45309"/>
+          <w:sz w:val="20"/>
+          <w:szCs w:val="20"/>
+        </w:rPr>
+        <w:t xml:space="preserve">caught at &lt;step&gt;</w:t>
+      </w:r>
+      <w:r>
+        <w:rPr>
+          <w:rFonts w:ascii="Georgia" w:cs="Georgia" w:eastAsia="Georgia" w:hAnsi="Georgia"/>
+          <w:color w:val="0F172A"/>
+          <w:sz w:val="22"/>
+          <w:szCs w:val="22"/>
+        </w:rPr>
+        <w:t xml:space="preserve"> trail in the commit log.</w:t>
+      </w:r>
+    </w:p>
+    <w:p>
+      <w:pPr>
+        <w:pStyle w:val="ListParagraph"/>
+        <w:numPr>
+          <w:ilvl w:val="0"/>
+          <w:numId w:val="2"/>
+        </w:numPr>
+        <w:spacing w:after="80" w:line="300"/>
+      </w:pPr>
+      <w:r>
+        <w:rPr>
+          <w:rFonts w:ascii="Georgia" w:cs="Georgia" w:eastAsia="Georgia" w:hAnsi="Georgia"/>
+          <w:b/>
+          <w:bCs/>
+          <w:color w:val="0F172A"/>
+          <w:sz w:val="22"/>
+          <w:szCs w:val="22"/>
+        </w:rPr>
+        <w:t xml:space="preserve">First real Dispatch:</w:t>
       </w:r>
       <w:r>
         <w:rPr>
@@ -2949,74 +3061,36 @@
           <w:sz w:val="22"/>
           <w:szCs w:val="22"/>
         </w:rPr>
-        <w:t xml:space="preserve">temporary</w:t>
-      </w:r>
-      <w:r>
-        <w:rPr>
-          <w:rFonts w:ascii="Georgia" w:cs="Georgia" w:eastAsia="Georgia" w:hAnsi="Georgia"/>
-          <w:color w:val="0F172A"/>
-          <w:sz w:val="22"/>
-          <w:szCs w:val="22"/>
-        </w:rPr>
-        <w:t xml:space="preserve">); Supabase migration applied to project </w:t>
-      </w:r>
-      <w:r>
-        <w:rPr>
-          <w:rFonts w:ascii="Menlo" w:cs="Menlo" w:eastAsia="Menlo" w:hAnsi="Menlo"/>
-          <w:color w:val="B45309"/>
-          <w:sz w:val="20"/>
-          <w:szCs w:val="20"/>
-        </w:rPr>
-        <w:t xml:space="preserve">agentify</w:t>
-      </w:r>
-      <w:r>
-        <w:rPr>
-          <w:rFonts w:ascii="Georgia" w:cs="Georgia" w:eastAsia="Georgia" w:hAnsi="Georgia"/>
-          <w:color w:val="0F172A"/>
-          <w:sz w:val="22"/>
-          <w:szCs w:val="22"/>
-        </w:rPr>
-        <w:t xml:space="preserve"> (</w:t>
-      </w:r>
-      <w:r>
-        <w:rPr>
-          <w:rFonts w:ascii="Menlo" w:cs="Menlo" w:eastAsia="Menlo" w:hAnsi="Menlo"/>
-          <w:color w:val="B45309"/>
-          <w:sz w:val="20"/>
-          <w:szCs w:val="20"/>
-        </w:rPr>
-        <w:t xml:space="preserve">ijmkekioxhfcinkjckju</w:t>
-      </w:r>
-      <w:r>
-        <w:rPr>
-          <w:rFonts w:ascii="Georgia" w:cs="Georgia" w:eastAsia="Georgia" w:hAnsi="Georgia"/>
-          <w:color w:val="0F172A"/>
-          <w:sz w:val="22"/>
-          <w:szCs w:val="22"/>
-        </w:rPr>
-        <w:t xml:space="preserve">); </w:t>
-      </w:r>
-      <w:r>
-        <w:rPr>
-          <w:rFonts w:ascii="Georgia" w:cs="Georgia" w:eastAsia="Georgia" w:hAnsi="Georgia"/>
-          <w:b/>
-          <w:bCs/>
-          <w:color w:val="0F172A"/>
-          <w:sz w:val="22"/>
-          <w:szCs w:val="22"/>
-        </w:rPr>
-        <w:t xml:space="preserve">Stage A UAT PASS 9/9 on 2026-05-13</w:t>
-      </w:r>
-      <w:r>
-        <w:rPr>
-          <w:rFonts w:ascii="Georgia" w:cs="Georgia" w:eastAsia="Georgia" w:hAnsi="Georgia"/>
-          <w:color w:val="0F172A"/>
-          <w:sz w:val="22"/>
-          <w:szCs w:val="22"/>
-        </w:rPr>
-        <w:t xml:space="preserve"> (</w:t>
-      </w:r>
-      <w:hyperlink w:history="1" r:id="rId31hnfjz968hg0smvgrefp">
+        <w:t xml:space="preserve">"Four Weeks That Bent the AI Arc"</w:t>
+      </w:r>
+      <w:r>
+        <w:rPr>
+          <w:rFonts w:ascii="Georgia" w:cs="Georgia" w:eastAsia="Georgia" w:hAnsi="Georgia"/>
+          <w:color w:val="0F172A"/>
+          <w:sz w:val="22"/>
+          <w:szCs w:val="22"/>
+        </w:rPr>
+        <w:t xml:space="preserve"> (commit </w:t>
+      </w:r>
+      <w:r>
+        <w:rPr>
+          <w:rFonts w:ascii="Menlo" w:cs="Menlo" w:eastAsia="Menlo" w:hAnsi="Menlo"/>
+          <w:color w:val="B45309"/>
+          <w:sz w:val="20"/>
+          <w:szCs w:val="20"/>
+        </w:rPr>
+        <w:t xml:space="preserve">36c3357</w:t>
+      </w:r>
+      <w:r>
+        <w:rPr>
+          <w:rFonts w:ascii="Georgia" w:cs="Georgia" w:eastAsia="Georgia" w:hAnsi="Georgia"/>
+          <w:color w:val="0F172A"/>
+          <w:sz w:val="22"/>
+          <w:szCs w:val="22"/>
+        </w:rPr>
+        <w:t xml:space="preserve">) is live at </w:t>
+      </w:r>
+      <w:hyperlink w:history="1" r:id="rId2qqm-om22lvmatp4rciot">
         <w:r>
           <w:rPr>
             <w:rFonts w:ascii="Georgia" w:cs="Georgia" w:eastAsia="Georgia" w:hAnsi="Georgia"/>
@@ -3025,7 +3099,7 @@
             <w:szCs w:val="22"/>
             <w:u w:val="single"/>
           </w:rPr>
-          <w:t xml:space="preserve">results</w:t>
+          <w:t xml:space="preserve">`/blog/four-weeks-that-bent-the-ai-arc`</w:t>
         </w:r>
       </w:hyperlink>
       <w:r>
@@ -3035,30 +3109,71 @@
           <w:sz w:val="22"/>
           <w:szCs w:val="22"/>
         </w:rPr>
-        <w:t xml:space="preserve">). Stage B (10 in-browser steps) is the only remaining gate — queued for Tarry's morning run with fresh eyes. Once Stage B closes, clear </w:t>
-      </w:r>
-      <w:r>
-        <w:rPr>
-          <w:rFonts w:ascii="Menlo" w:cs="Menlo" w:eastAsia="Menlo" w:hAnsi="Menlo"/>
-          <w:color w:val="B45309"/>
-          <w:sz w:val="20"/>
-          <w:szCs w:val="20"/>
-        </w:rPr>
-        <w:t xml:space="preserve">STUDIO_AI_DEBUG=1</w:t>
-      </w:r>
-      <w:r>
-        <w:rPr>
-          <w:rFonts w:ascii="Georgia" w:cs="Georgia" w:eastAsia="Georgia" w:hAnsi="Georgia"/>
-          <w:color w:val="0F172A"/>
-          <w:sz w:val="22"/>
-          <w:szCs w:val="22"/>
-        </w:rPr>
-        <w:t xml:space="preserve"> from Vercel.</w:t>
-      </w:r>
-    </w:p>
-    <w:p>
-      <w:pPr>
-        <w:spacing w:after="140" w:line="320"/>
+        <w:t xml:space="preserve">, surfaced in </w:t>
+      </w:r>
+      <w:r>
+        <w:rPr>
+          <w:rFonts w:ascii="Menlo" w:cs="Menlo" w:eastAsia="Menlo" w:hAnsi="Menlo"/>
+          <w:color w:val="B45309"/>
+          <w:sz w:val="20"/>
+          <w:szCs w:val="20"/>
+        </w:rPr>
+        <w:t xml:space="preserve">/blog/rss.xml</w:t>
+      </w:r>
+      <w:r>
+        <w:rPr>
+          <w:rFonts w:ascii="Georgia" w:cs="Georgia" w:eastAsia="Georgia" w:hAnsi="Georgia"/>
+          <w:color w:val="0F172A"/>
+          <w:sz w:val="22"/>
+          <w:szCs w:val="22"/>
+        </w:rPr>
+        <w:t xml:space="preserve">, and the draft row was correctly deleted from Supabase after publish (</w:t>
+      </w:r>
+      <w:r>
+        <w:rPr>
+          <w:rFonts w:ascii="Menlo" w:cs="Menlo" w:eastAsia="Menlo" w:hAnsi="Menlo"/>
+          <w:color w:val="B45309"/>
+          <w:sz w:val="20"/>
+          <w:szCs w:val="20"/>
+        </w:rPr>
+        <w:t xml:space="preserve">studio_drafts</w:t>
+      </w:r>
+      <w:r>
+        <w:rPr>
+          <w:rFonts w:ascii="Georgia" w:cs="Georgia" w:eastAsia="Georgia" w:hAnsi="Georgia"/>
+          <w:color w:val="0F172A"/>
+          <w:sz w:val="22"/>
+          <w:szCs w:val="22"/>
+        </w:rPr>
+        <w:t xml:space="preserve"> </w:t>
+      </w:r>
+      <w:r>
+        <w:rPr>
+          <w:rFonts w:ascii="Menlo" w:cs="Menlo" w:eastAsia="Menlo" w:hAnsi="Menlo"/>
+          <w:color w:val="B45309"/>
+          <w:sz w:val="20"/>
+          <w:szCs w:val="20"/>
+        </w:rPr>
+        <w:t xml:space="preserve">count: 0</w:t>
+      </w:r>
+      <w:r>
+        <w:rPr>
+          <w:rFonts w:ascii="Georgia" w:cs="Georgia" w:eastAsia="Georgia" w:hAnsi="Georgia"/>
+          <w:color w:val="0F172A"/>
+          <w:sz w:val="22"/>
+          <w:szCs w:val="22"/>
+        </w:rPr>
+        <w:t xml:space="preserve">).</w:t>
+      </w:r>
+    </w:p>
+    <w:p>
+      <w:pPr>
+        <w:pStyle w:val="ListParagraph"/>
+        <w:numPr>
+          <w:ilvl w:val="0"/>
+          <w:numId w:val="2"/>
+        </w:numPr>
+        <w:spacing w:after="80" w:line="300"/>
       </w:pPr>
       <w:r>
         <w:rPr>
@@ -3069,6 +3184,369 @@
           <w:sz w:val="22"/>
           <w:szCs w:val="22"/>
         </w:rPr>
+        <w:t xml:space="preserve">Env vars on Vercel (`tarrysingh-com-zdmb`):</w:t>
+      </w:r>
+      <w:r>
+        <w:rPr>
+          <w:rFonts w:ascii="Georgia" w:cs="Georgia" w:eastAsia="Georgia" w:hAnsi="Georgia"/>
+          <w:color w:val="0F172A"/>
+          <w:sz w:val="22"/>
+          <w:szCs w:val="22"/>
+        </w:rPr>
+        <w:t xml:space="preserve"> </w:t>
+      </w:r>
+      <w:r>
+        <w:rPr>
+          <w:rFonts w:ascii="Menlo" w:cs="Menlo" w:eastAsia="Menlo" w:hAnsi="Menlo"/>
+          <w:color w:val="B45309"/>
+          <w:sz w:val="20"/>
+          <w:szCs w:val="20"/>
+        </w:rPr>
+        <w:t xml:space="preserve">STUDIO_USER</w:t>
+      </w:r>
+      <w:r>
+        <w:rPr>
+          <w:rFonts w:ascii="Georgia" w:cs="Georgia" w:eastAsia="Georgia" w:hAnsi="Georgia"/>
+          <w:color w:val="0F172A"/>
+          <w:sz w:val="22"/>
+          <w:szCs w:val="22"/>
+        </w:rPr>
+        <w:t xml:space="preserve">, </w:t>
+      </w:r>
+      <w:r>
+        <w:rPr>
+          <w:rFonts w:ascii="Menlo" w:cs="Menlo" w:eastAsia="Menlo" w:hAnsi="Menlo"/>
+          <w:color w:val="B45309"/>
+          <w:sz w:val="20"/>
+          <w:szCs w:val="20"/>
+        </w:rPr>
+        <w:t xml:space="preserve">STUDIO_PASS</w:t>
+      </w:r>
+      <w:r>
+        <w:rPr>
+          <w:rFonts w:ascii="Georgia" w:cs="Georgia" w:eastAsia="Georgia" w:hAnsi="Georgia"/>
+          <w:color w:val="0F172A"/>
+          <w:sz w:val="22"/>
+          <w:szCs w:val="22"/>
+        </w:rPr>
+        <w:t xml:space="preserve">, </w:t>
+      </w:r>
+      <w:r>
+        <w:rPr>
+          <w:rFonts w:ascii="Menlo" w:cs="Menlo" w:eastAsia="Menlo" w:hAnsi="Menlo"/>
+          <w:color w:val="B45309"/>
+          <w:sz w:val="20"/>
+          <w:szCs w:val="20"/>
+        </w:rPr>
+        <w:t xml:space="preserve">STUDIO_GITHUB_TOKEN</w:t>
+      </w:r>
+      <w:r>
+        <w:rPr>
+          <w:rFonts w:ascii="Georgia" w:cs="Georgia" w:eastAsia="Georgia" w:hAnsi="Georgia"/>
+          <w:color w:val="0F172A"/>
+          <w:sz w:val="22"/>
+          <w:szCs w:val="22"/>
+        </w:rPr>
+        <w:t xml:space="preserve">, </w:t>
+      </w:r>
+      <w:r>
+        <w:rPr>
+          <w:rFonts w:ascii="Menlo" w:cs="Menlo" w:eastAsia="Menlo" w:hAnsi="Menlo"/>
+          <w:color w:val="B45309"/>
+          <w:sz w:val="20"/>
+          <w:szCs w:val="20"/>
+        </w:rPr>
+        <w:t xml:space="preserve">ANTHROPIC_API_KEY</w:t>
+      </w:r>
+      <w:r>
+        <w:rPr>
+          <w:rFonts w:ascii="Georgia" w:cs="Georgia" w:eastAsia="Georgia" w:hAnsi="Georgia"/>
+          <w:color w:val="0F172A"/>
+          <w:sz w:val="22"/>
+          <w:szCs w:val="22"/>
+        </w:rPr>
+        <w:t xml:space="preserve"> (post-rotation), </w:t>
+      </w:r>
+      <w:r>
+        <w:rPr>
+          <w:rFonts w:ascii="Menlo" w:cs="Menlo" w:eastAsia="Menlo" w:hAnsi="Menlo"/>
+          <w:color w:val="B45309"/>
+          <w:sz w:val="20"/>
+          <w:szCs w:val="20"/>
+        </w:rPr>
+        <w:t xml:space="preserve">STUDIO_AI_MODEL=claude-opus-4-6</w:t>
+      </w:r>
+      <w:r>
+        <w:rPr>
+          <w:rFonts w:ascii="Georgia" w:cs="Georgia" w:eastAsia="Georgia" w:hAnsi="Georgia"/>
+          <w:color w:val="0F172A"/>
+          <w:sz w:val="22"/>
+          <w:szCs w:val="22"/>
+        </w:rPr>
+        <w:t xml:space="preserve">, </w:t>
+      </w:r>
+      <w:r>
+        <w:rPr>
+          <w:rFonts w:ascii="Menlo" w:cs="Menlo" w:eastAsia="Menlo" w:hAnsi="Menlo"/>
+          <w:color w:val="B45309"/>
+          <w:sz w:val="20"/>
+          <w:szCs w:val="20"/>
+        </w:rPr>
+        <w:t xml:space="preserve">STUDIO_AI_THINKING_TOKENS=4000</w:t>
+      </w:r>
+      <w:r>
+        <w:rPr>
+          <w:rFonts w:ascii="Georgia" w:cs="Georgia" w:eastAsia="Georgia" w:hAnsi="Georgia"/>
+          <w:color w:val="0F172A"/>
+          <w:sz w:val="22"/>
+          <w:szCs w:val="22"/>
+        </w:rPr>
+        <w:t xml:space="preserve">. </w:t>
+      </w:r>
+      <w:r>
+        <w:rPr>
+          <w:rFonts w:ascii="Georgia" w:cs="Georgia" w:eastAsia="Georgia" w:hAnsi="Georgia"/>
+          <w:b/>
+          <w:bCs/>
+          <w:color w:val="0F172A"/>
+          <w:sz w:val="22"/>
+          <w:szCs w:val="22"/>
+        </w:rPr>
+        <w:t xml:space="preserve">Pending Tarry-side housekeeping:</w:t>
+      </w:r>
+      <w:r>
+        <w:rPr>
+          <w:rFonts w:ascii="Georgia" w:cs="Georgia" w:eastAsia="Georgia" w:hAnsi="Georgia"/>
+          <w:color w:val="0F172A"/>
+          <w:sz w:val="22"/>
+          <w:szCs w:val="22"/>
+        </w:rPr>
+        <w:t xml:space="preserve"> clear </w:t>
+      </w:r>
+      <w:r>
+        <w:rPr>
+          <w:rFonts w:ascii="Menlo" w:cs="Menlo" w:eastAsia="Menlo" w:hAnsi="Menlo"/>
+          <w:color w:val="B45309"/>
+          <w:sz w:val="20"/>
+          <w:szCs w:val="20"/>
+        </w:rPr>
+        <w:t xml:space="preserve">STUDIO_AI_DEBUG=1</w:t>
+      </w:r>
+      <w:r>
+        <w:rPr>
+          <w:rFonts w:ascii="Georgia" w:cs="Georgia" w:eastAsia="Georgia" w:hAnsi="Georgia"/>
+          <w:color w:val="0F172A"/>
+          <w:sz w:val="22"/>
+          <w:szCs w:val="22"/>
+        </w:rPr>
+        <w:t xml:space="preserve"> — diagnostic-only flag from Stage A.</w:t>
+      </w:r>
+    </w:p>
+    <w:p>
+      <w:pPr>
+        <w:pStyle w:val="ListParagraph"/>
+        <w:numPr>
+          <w:ilvl w:val="0"/>
+          <w:numId w:val="2"/>
+        </w:numPr>
+        <w:spacing w:after="80" w:line="300"/>
+      </w:pPr>
+      <w:r>
+        <w:rPr>
+          <w:rFonts w:ascii="Georgia" w:cs="Georgia" w:eastAsia="Georgia" w:hAnsi="Georgia"/>
+          <w:b/>
+          <w:bCs/>
+          <w:color w:val="0F172A"/>
+          <w:sz w:val="22"/>
+          <w:szCs w:val="22"/>
+        </w:rPr>
+        <w:t xml:space="preserve">Supabase migration:</w:t>
+      </w:r>
+      <w:r>
+        <w:rPr>
+          <w:rFonts w:ascii="Georgia" w:cs="Georgia" w:eastAsia="Georgia" w:hAnsi="Georgia"/>
+          <w:color w:val="0F172A"/>
+          <w:sz w:val="22"/>
+          <w:szCs w:val="22"/>
+        </w:rPr>
+        <w:t xml:space="preserve"> </w:t>
+      </w:r>
+      <w:r>
+        <w:rPr>
+          <w:rFonts w:ascii="Menlo" w:cs="Menlo" w:eastAsia="Menlo" w:hAnsi="Menlo"/>
+          <w:color w:val="B45309"/>
+          <w:sz w:val="20"/>
+          <w:szCs w:val="20"/>
+        </w:rPr>
+        <w:t xml:space="preserve">2026-05-13-studio-drafts.sql</w:t>
+      </w:r>
+      <w:r>
+        <w:rPr>
+          <w:rFonts w:ascii="Georgia" w:cs="Georgia" w:eastAsia="Georgia" w:hAnsi="Georgia"/>
+          <w:color w:val="0F172A"/>
+          <w:sz w:val="22"/>
+          <w:szCs w:val="22"/>
+        </w:rPr>
+        <w:t xml:space="preserve"> applied to project </w:t>
+      </w:r>
+      <w:r>
+        <w:rPr>
+          <w:rFonts w:ascii="Menlo" w:cs="Menlo" w:eastAsia="Menlo" w:hAnsi="Menlo"/>
+          <w:color w:val="B45309"/>
+          <w:sz w:val="20"/>
+          <w:szCs w:val="20"/>
+        </w:rPr>
+        <w:t xml:space="preserve">agentify</w:t>
+      </w:r>
+      <w:r>
+        <w:rPr>
+          <w:rFonts w:ascii="Georgia" w:cs="Georgia" w:eastAsia="Georgia" w:hAnsi="Georgia"/>
+          <w:color w:val="0F172A"/>
+          <w:sz w:val="22"/>
+          <w:szCs w:val="22"/>
+        </w:rPr>
+        <w:t xml:space="preserve"> (</w:t>
+      </w:r>
+      <w:r>
+        <w:rPr>
+          <w:rFonts w:ascii="Menlo" w:cs="Menlo" w:eastAsia="Menlo" w:hAnsi="Menlo"/>
+          <w:color w:val="B45309"/>
+          <w:sz w:val="20"/>
+          <w:szCs w:val="20"/>
+        </w:rPr>
+        <w:t xml:space="preserve">ijmkekioxhfcinkjckju</w:t>
+      </w:r>
+      <w:r>
+        <w:rPr>
+          <w:rFonts w:ascii="Georgia" w:cs="Georgia" w:eastAsia="Georgia" w:hAnsi="Georgia"/>
+          <w:color w:val="0F172A"/>
+          <w:sz w:val="22"/>
+          <w:szCs w:val="22"/>
+        </w:rPr>
+        <w:t xml:space="preserve">).</w:t>
+      </w:r>
+    </w:p>
+    <w:p>
+      <w:pPr>
+        <w:pStyle w:val="ListParagraph"/>
+        <w:numPr>
+          <w:ilvl w:val="0"/>
+          <w:numId w:val="2"/>
+        </w:numPr>
+        <w:spacing w:after="80" w:line="300"/>
+      </w:pPr>
+      <w:r>
+        <w:rPr>
+          <w:rFonts w:ascii="Georgia" w:cs="Georgia" w:eastAsia="Georgia" w:hAnsi="Georgia"/>
+          <w:b/>
+          <w:bCs/>
+          <w:color w:val="0F172A"/>
+          <w:sz w:val="22"/>
+          <w:szCs w:val="22"/>
+        </w:rPr>
+        <w:t xml:space="preserve">UAT artefacts:</w:t>
+      </w:r>
+      <w:r>
+        <w:rPr>
+          <w:rFonts w:ascii="Georgia" w:cs="Georgia" w:eastAsia="Georgia" w:hAnsi="Georgia"/>
+          <w:color w:val="0F172A"/>
+          <w:sz w:val="22"/>
+          <w:szCs w:val="22"/>
+        </w:rPr>
+        <w:t xml:space="preserve"> </w:t>
+      </w:r>
+      <w:hyperlink w:history="1" r:id="rIdlmttkzzy-afka6e_q8r0x">
+        <w:r>
+          <w:rPr>
+            <w:rFonts w:ascii="Georgia" w:cs="Georgia" w:eastAsia="Georgia" w:hAnsi="Georgia"/>
+            <w:color w:val="1D4ED8"/>
+            <w:sz w:val="22"/>
+            <w:szCs w:val="22"/>
+            <w:u w:val="single"/>
+          </w:rPr>
+          <w:t xml:space="preserve">`sprint-3-uat-plan.md`</w:t>
+        </w:r>
+      </w:hyperlink>
+      <w:r>
+        <w:rPr>
+          <w:rFonts w:ascii="Georgia" w:cs="Georgia" w:eastAsia="Georgia" w:hAnsi="Georgia"/>
+          <w:color w:val="0F172A"/>
+          <w:sz w:val="22"/>
+          <w:szCs w:val="22"/>
+        </w:rPr>
+        <w:t xml:space="preserve"> · </w:t>
+      </w:r>
+      <w:hyperlink w:history="1" r:id="rId9-6peotnfodxey1fnebgn">
+        <w:r>
+          <w:rPr>
+            <w:rFonts w:ascii="Georgia" w:cs="Georgia" w:eastAsia="Georgia" w:hAnsi="Georgia"/>
+            <w:color w:val="1D4ED8"/>
+            <w:sz w:val="22"/>
+            <w:szCs w:val="22"/>
+            <w:u w:val="single"/>
+          </w:rPr>
+          <w:t xml:space="preserve">`sprint-3-uat-results.md`</w:t>
+        </w:r>
+      </w:hyperlink>
+      <w:r>
+        <w:rPr>
+          <w:rFonts w:ascii="Georgia" w:cs="Georgia" w:eastAsia="Georgia" w:hAnsi="Georgia"/>
+          <w:color w:val="0F172A"/>
+          <w:sz w:val="22"/>
+          <w:szCs w:val="22"/>
+        </w:rPr>
+        <w:t xml:space="preserve"> · </w:t>
+      </w:r>
+      <w:r>
+        <w:rPr>
+          <w:rFonts w:ascii="Menlo" w:cs="Menlo" w:eastAsia="Menlo" w:hAnsi="Menlo"/>
+          <w:color w:val="B45309"/>
+          <w:sz w:val="20"/>
+          <w:szCs w:val="20"/>
+        </w:rPr>
+        <w:t xml:space="preserve">.docx</w:t>
+      </w:r>
+      <w:r>
+        <w:rPr>
+          <w:rFonts w:ascii="Georgia" w:cs="Georgia" w:eastAsia="Georgia" w:hAnsi="Georgia"/>
+          <w:color w:val="0F172A"/>
+          <w:sz w:val="22"/>
+          <w:szCs w:val="22"/>
+        </w:rPr>
+        <w:t xml:space="preserve"> mirror of each generated via </w:t>
+      </w:r>
+      <w:r>
+        <w:rPr>
+          <w:rFonts w:ascii="Menlo" w:cs="Menlo" w:eastAsia="Menlo" w:hAnsi="Menlo"/>
+          <w:color w:val="B45309"/>
+          <w:sz w:val="20"/>
+          <w:szCs w:val="20"/>
+        </w:rPr>
+        <w:t xml:space="preserve">npm run reports:uat-{plan,results}:docx</w:t>
+      </w:r>
+      <w:r>
+        <w:rPr>
+          <w:rFonts w:ascii="Georgia" w:cs="Georgia" w:eastAsia="Georgia" w:hAnsi="Georgia"/>
+          <w:color w:val="0F172A"/>
+          <w:sz w:val="22"/>
+          <w:szCs w:val="22"/>
+        </w:rPr>
+        <w:t xml:space="preserve">.</w:t>
+      </w:r>
+    </w:p>
+    <w:p>
+      <w:pPr>
+        <w:spacing w:after="140" w:line="320"/>
+      </w:pPr>
+      <w:r>
+        <w:rPr>
+          <w:rFonts w:ascii="Georgia" w:cs="Georgia" w:eastAsia="Georgia" w:hAnsi="Georgia"/>
+          <w:b/>
+          <w:bCs/>
+          <w:color w:val="0F172A"/>
+          <w:sz w:val="22"/>
+          <w:szCs w:val="22"/>
+        </w:rPr>
         <w:t xml:space="preserve">What's deliberately not in Sprint 3 (deferred to v2+):</w:t>
       </w:r>
       <w:r>
@@ -3078,7 +3556,43 @@
           <w:sz w:val="22"/>
           <w:szCs w:val="22"/>
         </w:rPr>
-        <w:t xml:space="preserve"> AI-rendered hero images · image upload / crop / paste-from-clipboard · real-time collaborative editing · mobile-first writing UX · version-history surface · AI-suggested frontmatter · linked editing for the Synaptic plate library.</w:t>
+        <w:t xml:space="preserve"> AI-rendered hero images · image upload / crop / paste-from-clipboard · real-time collaborative editing · mobile-first writing UX · version-history surface · AI-suggested frontmatter · linked editing for the Synaptic plate library · </w:t>
+      </w:r>
+      <w:r>
+        <w:rPr>
+          <w:rFonts w:ascii="Menlo" w:cs="Menlo" w:eastAsia="Menlo" w:hAnsi="Menlo"/>
+          <w:color w:val="B45309"/>
+          <w:sz w:val="20"/>
+          <w:szCs w:val="20"/>
+        </w:rPr>
+        <w:t xml:space="preserve">theme: studio</w:t>
+      </w:r>
+      <w:r>
+        <w:rPr>
+          <w:rFonts w:ascii="Georgia" w:cs="Georgia" w:eastAsia="Georgia" w:hAnsi="Georgia"/>
+          <w:color w:val="0F172A"/>
+          <w:sz w:val="22"/>
+          <w:szCs w:val="22"/>
+        </w:rPr>
+        <w:t xml:space="preserve"> palette variant · </w:t>
+      </w:r>
+      <w:r>
+        <w:rPr>
+          <w:rFonts w:ascii="Menlo" w:cs="Menlo" w:eastAsia="Menlo" w:hAnsi="Menlo"/>
+          <w:color w:val="B45309"/>
+          <w:sz w:val="20"/>
+          <w:szCs w:val="20"/>
+        </w:rPr>
+        <w:t xml:space="preserve">tags</w:t>
+      </w:r>
+      <w:r>
+        <w:rPr>
+          <w:rFonts w:ascii="Georgia" w:cs="Georgia" w:eastAsia="Georgia" w:hAnsi="Georgia"/>
+          <w:color w:val="0F172A"/>
+          <w:sz w:val="22"/>
+          <w:szCs w:val="22"/>
+        </w:rPr>
+        <w:t xml:space="preserve"> surface on post + index · reader-side subscribe nudges (six experiments).</w:t>
       </w:r>
     </w:p>
     <w:p>
@@ -3092,9 +3606,9 @@
           <w:sz w:val="22"/>
           <w:szCs w:val="22"/>
         </w:rPr>
-        <w:t xml:space="preserve">These seven items are sequenced and sized in </w:t>
-      </w:r>
-      <w:hyperlink w:history="1" r:id="rIdzotif9sqknhzfuri36fgs">
+        <w:t xml:space="preserve">These items are sequenced and sized in </w:t>
+      </w:r>
+      <w:hyperlink w:history="1" r:id="rIdcvipkzgycrbm7y_nw_x2r">
         <w:r>
           <w:rPr>
             <w:rFonts w:ascii="Georgia" w:cs="Georgia" w:eastAsia="Georgia" w:hAnsi="Georgia"/>
@@ -3113,7 +3627,7 @@
           <w:sz w:val="22"/>
           <w:szCs w:val="22"/>
         </w:rPr>
-        <w:t xml:space="preserve"> — read it cold to know what's coming and in what order.</w:t>
+        <w:t xml:space="preserve"> — Sprint 4.5 picks up the theme/tags surface SP3-08/SP3-09 caught at Stage B post-B8; Sprint 5.5 is the new reader-side track. Read it cold to know what's coming and in what order.</w:t>
       </w:r>
     </w:p>
     <w:p>
@@ -14245,7 +14759,7 @@
                 <w:sz w:val="20"/>
                 <w:szCs w:val="20"/>
               </w:rPr>
-              <w:t xml:space="preserve">Sprint 3 — Studio Editor (WYSIWYG + Claude Opus 4.7-extended AI + one-click publish)</w:t>
+              <w:t xml:space="preserve">Sprint 3 — Studio Editor (WYSIWYG + Claude Opus extended-thinking AI + one-click publish)</w:t>
             </w:r>
           </w:p>
         </w:tc>
@@ -14273,7 +14787,36 @@
                 <w:sz w:val="20"/>
                 <w:szCs w:val="20"/>
               </w:rPr>
-              <w:t xml:space="preserve">kicked off 2026-05-13</w:t>
+              <w:t xml:space="preserve">closed 2026-05-14 — Stage A 9/9 + Stage B 10/10 PASS; 7 follow-up fixes caught + shipped mid-flight; first real Dispatch </w:t>
+            </w:r>
+            <w:r>
+              <w:rPr>
+                <w:rFonts w:ascii="Georgia" w:cs="Georgia" w:eastAsia="Georgia" w:hAnsi="Georgia"/>
+                <w:i/>
+                <w:iCs/>
+                <w:color w:val="0F172A"/>
+                <w:sz w:val="20"/>
+                <w:szCs w:val="20"/>
+              </w:rPr>
+              <w:t xml:space="preserve">"Four Weeks That Bent the AI Arc"</w:t>
+            </w:r>
+            <w:r>
+              <w:rPr>
+                <w:rFonts w:ascii="Georgia" w:cs="Georgia" w:eastAsia="Georgia" w:hAnsi="Georgia"/>
+                <w:color w:val="0F172A"/>
+                <w:sz w:val="20"/>
+                <w:szCs w:val="20"/>
+              </w:rPr>
+              <w:t xml:space="preserve"> live at </w:t>
+            </w:r>
+            <w:r>
+              <w:rPr>
+                <w:rFonts w:ascii="Menlo" w:cs="Menlo" w:eastAsia="Menlo" w:hAnsi="Menlo"/>
+                <w:color w:val="B45309"/>
+                <w:sz w:val="20"/>
+                <w:szCs w:val="20"/>
+              </w:rPr>
+              <w:t xml:space="preserve">/blog/four-weeks-that-bent-the-ai-arc</w:t>
             </w:r>
           </w:p>
         </w:tc>
@@ -14301,7 +14844,7 @@
                 <w:sz w:val="20"/>
                 <w:szCs w:val="20"/>
               </w:rPr>
-              <w:t xml:space="preserve">in progress</w:t>
+              <w:t xml:space="preserve">Tarry Singh ✓ Stage B (2026-05-14) · Claude ✓ Stage A (2026-05-13)</w:t>
             </w:r>
           </w:p>
         </w:tc>

</xml_diff>

<commit_message>
docs(reports): STUDIO_AI_DEBUG=1 cleared from Vercel — Sprint 3 fully closed
Tarry cleared the diagnostic flag from tarrysingh-com-zdmb on
2026-05-14 (Dev / Preview / Prod). Auto-redeploy followed.

Flips the two "pending Tarry-side housekeeping" mentions in
sprint-3-uat-results.md and dispatches-status-report.md to done.
Regens both .docx mirrors.

Sprint 3 close-out is now archive-complete with zero pending
items.

Co-Authored-By: Claude Opus 4.7 (1M context) <noreply@anthropic.com>
</commit_message>
<xml_diff>
--- a/docs/reports/dispatches-status-report.docx
+++ b/docs/reports/dispatches-status-report.docx
@@ -121,7 +121,7 @@
         </w:rPr>
         <w:t xml:space="preserve"> </w:t>
       </w:r>
-      <w:hyperlink w:history="1" r:id="rIdpfli7dxytvlfntgowujq3">
+      <w:hyperlink w:history="1" r:id="rIds2ge1bo2l3yc_oliijlci">
         <w:r>
           <w:rPr>
             <w:rFonts w:ascii="Georgia" w:cs="Georgia" w:eastAsia="Georgia" w:hAnsi="Georgia"/>
@@ -3090,7 +3090,7 @@
         </w:rPr>
         <w:t xml:space="preserve">) is live at </w:t>
       </w:r>
-      <w:hyperlink w:history="1" r:id="rId2qqm-om22lvmatp4rciot">
+      <w:hyperlink w:history="1" r:id="rIdbpqdcv56zewhoexsvaekn">
         <w:r>
           <w:rPr>
             <w:rFonts w:ascii="Georgia" w:cs="Georgia" w:eastAsia="Georgia" w:hAnsi="Georgia"/>
@@ -3312,34 +3312,16 @@
           <w:sz w:val="22"/>
           <w:szCs w:val="22"/>
         </w:rPr>
-        <w:t xml:space="preserve">Pending Tarry-side housekeeping:</w:t>
-      </w:r>
-      <w:r>
-        <w:rPr>
-          <w:rFonts w:ascii="Georgia" w:cs="Georgia" w:eastAsia="Georgia" w:hAnsi="Georgia"/>
-          <w:color w:val="0F172A"/>
-          <w:sz w:val="22"/>
-          <w:szCs w:val="22"/>
-        </w:rPr>
-        <w:t xml:space="preserve"> clear </w:t>
-      </w:r>
-      <w:r>
-        <w:rPr>
-          <w:rFonts w:ascii="Menlo" w:cs="Menlo" w:eastAsia="Menlo" w:hAnsi="Menlo"/>
-          <w:color w:val="B45309"/>
-          <w:sz w:val="20"/>
-          <w:szCs w:val="20"/>
-        </w:rPr>
-        <w:t xml:space="preserve">STUDIO_AI_DEBUG=1</w:t>
-      </w:r>
-      <w:r>
-        <w:rPr>
-          <w:rFonts w:ascii="Georgia" w:cs="Georgia" w:eastAsia="Georgia" w:hAnsi="Georgia"/>
-          <w:color w:val="0F172A"/>
-          <w:sz w:val="22"/>
-          <w:szCs w:val="22"/>
-        </w:rPr>
-        <w:t xml:space="preserve"> — diagnostic-only flag from Stage A.</w:t>
+        <w:t xml:space="preserve">`STUDIO_AI_DEBUG=1` cleared 2026-05-14</w:t>
+      </w:r>
+      <w:r>
+        <w:rPr>
+          <w:rFonts w:ascii="Georgia" w:cs="Georgia" w:eastAsia="Georgia" w:hAnsi="Georgia"/>
+          <w:color w:val="0F172A"/>
+          <w:sz w:val="22"/>
+          <w:szCs w:val="22"/>
+        </w:rPr>
+        <w:t xml:space="preserve"> — diagnostic flag from Stage A removed; auto-redeploy followed.</w:t>
       </w:r>
     </w:p>
     <w:p>
@@ -3455,7 +3437,7 @@
         </w:rPr>
         <w:t xml:space="preserve"> </w:t>
       </w:r>
-      <w:hyperlink w:history="1" r:id="rIdlmttkzzy-afka6e_q8r0x">
+      <w:hyperlink w:history="1" r:id="rId2xasi3sud5cz6kmxpxkcc">
         <w:r>
           <w:rPr>
             <w:rFonts w:ascii="Georgia" w:cs="Georgia" w:eastAsia="Georgia" w:hAnsi="Georgia"/>
@@ -3476,7 +3458,7 @@
         </w:rPr>
         <w:t xml:space="preserve"> · </w:t>
       </w:r>
-      <w:hyperlink w:history="1" r:id="rId9-6peotnfodxey1fnebgn">
+      <w:hyperlink w:history="1" r:id="rIdsgjvp8rzy8p9yuicyte4o">
         <w:r>
           <w:rPr>
             <w:rFonts w:ascii="Georgia" w:cs="Georgia" w:eastAsia="Georgia" w:hAnsi="Georgia"/>
@@ -3608,7 +3590,7 @@
         </w:rPr>
         <w:t xml:space="preserve">These items are sequenced and sized in </w:t>
       </w:r>
-      <w:hyperlink w:history="1" r:id="rIdcvipkzgycrbm7y_nw_x2r">
+      <w:hyperlink w:history="1" r:id="rIdkeb38ctitwiphin2hylbw">
         <w:r>
           <w:rPr>
             <w:rFonts w:ascii="Georgia" w:cs="Georgia" w:eastAsia="Georgia" w:hAnsi="Georgia"/>

</xml_diff>

<commit_message>
docs(reports): Sprint 4 close — roadmap "shipped" + status report row
Sprint 4 code-complete 2026-05-14, awaiting Tarry-side UAT.

- .env.example: documents the new STUDIO_UPLOADS_BUCKET (optional;
  default "studio-uploads" matches the migration).
- sprint-4-plus-roadmap.md: header date bumped; sequence-at-a-glance
  Sprint 4 row crossed out + linked to the new "Sprint 4 — shipped
  2026-05-14" section that documents both halves with their commit
  shas, live state, and deliberate non-goals.
- dispatches-status-report.md: new Sprint 4 sub-section in the
  history table; sign-off row added (technical-side complete; UAT
  pending); glossary updated with the new migration + route paths.
- status report .docx regenerated.

Sprint 5 next on the queue: AI-rendered hero images, reusing the
new image-upload pipe.

Co-Authored-By: Claude Opus 4.7 (1M context) <noreply@anthropic.com>
</commit_message>
<xml_diff>
--- a/docs/reports/dispatches-status-report.docx
+++ b/docs/reports/dispatches-status-report.docx
@@ -61,25 +61,7 @@
           <w:sz w:val="22"/>
           <w:szCs w:val="22"/>
         </w:rPr>
-        <w:t xml:space="preserve"> 2026-05-14 (Sprint 3 closed — Stage A 9/9 PASS · Stage B 10/10 PASS · first real Dispatch live at </w:t>
-      </w:r>
-      <w:r>
-        <w:rPr>
-          <w:rFonts w:ascii="Menlo" w:cs="Menlo" w:eastAsia="Menlo" w:hAnsi="Menlo"/>
-          <w:color w:val="B45309"/>
-          <w:sz w:val="20"/>
-          <w:szCs w:val="20"/>
-        </w:rPr>
-        <w:t xml:space="preserve">/blog/four-weeks-that-bent-the-ai-arc</w:t>
-      </w:r>
-      <w:r>
-        <w:rPr>
-          <w:rFonts w:ascii="Georgia" w:cs="Georgia" w:eastAsia="Georgia" w:hAnsi="Georgia"/>
-          <w:color w:val="0F172A"/>
-          <w:sz w:val="22"/>
-          <w:szCs w:val="22"/>
-        </w:rPr>
-        <w:t xml:space="preserve">) </w:t>
+        <w:t xml:space="preserve"> 2026-05-14 (Sprint 4 code-complete — AI-suggested frontmatter + image upload to Supabase Storage; awaiting Tarry-side UAT) </w:t>
       </w:r>
       <w:r>
         <w:rPr>
@@ -121,7 +103,7 @@
         </w:rPr>
         <w:t xml:space="preserve"> </w:t>
       </w:r>
-      <w:hyperlink w:history="1" r:id="rIds2ge1bo2l3yc_oliijlci">
+      <w:hyperlink w:history="1" r:id="rIdb8mv4fcf5yd6wh2fep2jl">
         <w:r>
           <w:rPr>
             <w:rFonts w:ascii="Georgia" w:cs="Georgia" w:eastAsia="Georgia" w:hAnsi="Georgia"/>
@@ -3090,7 +3072,7 @@
         </w:rPr>
         <w:t xml:space="preserve">) is live at </w:t>
       </w:r>
-      <w:hyperlink w:history="1" r:id="rIdbpqdcv56zewhoexsvaekn">
+      <w:hyperlink w:history="1" r:id="rId0sonfmyuoz6-viyzqglum">
         <w:r>
           <w:rPr>
             <w:rFonts w:ascii="Georgia" w:cs="Georgia" w:eastAsia="Georgia" w:hAnsi="Georgia"/>
@@ -3437,7 +3419,7 @@
         </w:rPr>
         <w:t xml:space="preserve"> </w:t>
       </w:r>
-      <w:hyperlink w:history="1" r:id="rId2xasi3sud5cz6kmxpxkcc">
+      <w:hyperlink w:history="1" r:id="rIdwkf60j4cqhp5oqggzkox8">
         <w:r>
           <w:rPr>
             <w:rFonts w:ascii="Georgia" w:cs="Georgia" w:eastAsia="Georgia" w:hAnsi="Georgia"/>
@@ -3458,7 +3440,7 @@
         </w:rPr>
         <w:t xml:space="preserve"> · </w:t>
       </w:r>
-      <w:hyperlink w:history="1" r:id="rIdsgjvp8rzy8p9yuicyte4o">
+      <w:hyperlink w:history="1" r:id="rId7t4q22tfk3d877gwrvzzh">
         <w:r>
           <w:rPr>
             <w:rFonts w:ascii="Georgia" w:cs="Georgia" w:eastAsia="Georgia" w:hAnsi="Georgia"/>
@@ -3590,7 +3572,7 @@
         </w:rPr>
         <w:t xml:space="preserve">These items are sequenced and sized in </w:t>
       </w:r>
-      <w:hyperlink w:history="1" r:id="rIdkeb38ctitwiphin2hylbw">
+      <w:hyperlink w:history="1" r:id="rIdxtekz9ks9_lwrs4ywphxy">
         <w:r>
           <w:rPr>
             <w:rFonts w:ascii="Georgia" w:cs="Georgia" w:eastAsia="Georgia" w:hAnsi="Georgia"/>
@@ -3610,6 +3592,661 @@
           <w:szCs w:val="22"/>
         </w:rPr>
         <w:t xml:space="preserve"> — Sprint 4.5 picks up the theme/tags surface SP3-08/SP3-09 caught at Stage B post-B8; Sprint 5.5 is the new reader-side track. Read it cold to know what's coming and in what order.</w:t>
+      </w:r>
+    </w:p>
+    <w:p>
+      <w:pPr>
+        <w:pStyle w:val="Heading3"/>
+        <w:spacing w:after="120" w:before="220"/>
+      </w:pPr>
+      <w:r>
+        <w:rPr>
+          <w:rFonts w:ascii="Georgia" w:cs="Georgia" w:eastAsia="Georgia" w:hAnsi="Georgia"/>
+          <w:b/>
+          <w:bCs/>
+          <w:color w:val="0F172A"/>
+          <w:sz w:val="26"/>
+          <w:szCs w:val="26"/>
+        </w:rPr>
+        <w:t xml:space="preserve">Sprint 4 — AI-suggested frontmatter + image upload (code-complete 2026-05-14)</w:t>
+      </w:r>
+    </w:p>
+    <w:p>
+      <w:pPr>
+        <w:spacing w:after="140" w:line="320"/>
+      </w:pPr>
+      <w:r>
+        <w:rPr>
+          <w:rFonts w:ascii="Georgia" w:cs="Georgia" w:eastAsia="Georgia" w:hAnsi="Georgia"/>
+          <w:b/>
+          <w:bCs/>
+          <w:color w:val="0F172A"/>
+          <w:sz w:val="22"/>
+          <w:szCs w:val="22"/>
+        </w:rPr>
+        <w:t xml:space="preserve">Window:</w:t>
+      </w:r>
+      <w:r>
+        <w:rPr>
+          <w:rFonts w:ascii="Georgia" w:cs="Georgia" w:eastAsia="Georgia" w:hAnsi="Georgia"/>
+          <w:color w:val="0F172A"/>
+          <w:sz w:val="22"/>
+          <w:szCs w:val="22"/>
+        </w:rPr>
+        <w:t xml:space="preserve"> 2026-05-14 (single afternoon). Branch </w:t>
+      </w:r>
+      <w:r>
+        <w:rPr>
+          <w:rFonts w:ascii="Menlo" w:cs="Menlo" w:eastAsia="Menlo" w:hAnsi="Menlo"/>
+          <w:color w:val="B45309"/>
+          <w:sz w:val="20"/>
+          <w:szCs w:val="20"/>
+        </w:rPr>
+        <w:t xml:space="preserve">claude/sprint-4</w:t>
+      </w:r>
+      <w:r>
+        <w:rPr>
+          <w:rFonts w:ascii="Georgia" w:cs="Georgia" w:eastAsia="Georgia" w:hAnsi="Georgia"/>
+          <w:color w:val="0F172A"/>
+          <w:sz w:val="22"/>
+          <w:szCs w:val="22"/>
+        </w:rPr>
+        <w:t xml:space="preserve">.</w:t>
+      </w:r>
+    </w:p>
+    <w:tbl>
+      <w:tblPr>
+        <w:tblW w:type="dxa" w:w="9360"/>
+        <w:tblBorders>
+          <w:top w:val="single" w:color="auto" w:sz="4"/>
+          <w:left w:val="single" w:color="auto" w:sz="4"/>
+          <w:bottom w:val="single" w:color="auto" w:sz="4"/>
+          <w:right w:val="single" w:color="auto" w:sz="4"/>
+          <w:insideH w:val="single" w:color="auto" w:sz="4"/>
+          <w:insideV w:val="single" w:color="auto" w:sz="4"/>
+        </w:tblBorders>
+      </w:tblPr>
+      <w:tblGrid>
+        <w:gridCol w:w="3931"/>
+        <w:gridCol w:w="5429"/>
+      </w:tblGrid>
+      <w:tr>
+        <w:trPr>
+          <w:tblHeader/>
+        </w:trPr>
+        <w:tc>
+          <w:tcPr>
+            <w:tcW w:type="dxa" w:w="3931"/>
+            <w:tcBorders>
+              <w:top w:val="single" w:color="CBD5E1" w:sz="4"/>
+              <w:left w:val="single" w:color="CBD5E1" w:sz="4"/>
+              <w:bottom w:val="single" w:color="CBD5E1" w:sz="4"/>
+              <w:right w:val="single" w:color="CBD5E1" w:sz="4"/>
+            </w:tcBorders>
+            <w:shd w:fill="F8FAFC" w:val="clear"/>
+            <w:tcMar>
+              <w:top w:type="dxa" w:w="80"/>
+              <w:left w:type="dxa" w:w="140"/>
+              <w:bottom w:type="dxa" w:w="80"/>
+              <w:right w:type="dxa" w:w="140"/>
+            </w:tcMar>
+          </w:tcPr>
+          <w:p>
+            <w:r>
+              <w:rPr>
+                <w:rFonts w:ascii="Menlo" w:cs="Menlo" w:eastAsia="Menlo" w:hAnsi="Menlo"/>
+                <w:b/>
+                <w:bCs/>
+                <w:color w:val="0F172A"/>
+                <w:sz w:val="18"/>
+                <w:szCs w:val="18"/>
+              </w:rPr>
+              <w:t xml:space="preserve">Half</w:t>
+            </w:r>
+          </w:p>
+        </w:tc>
+        <w:tc>
+          <w:tcPr>
+            <w:tcW w:type="dxa" w:w="5429"/>
+            <w:tcBorders>
+              <w:top w:val="single" w:color="CBD5E1" w:sz="4"/>
+              <w:left w:val="single" w:color="CBD5E1" w:sz="4"/>
+              <w:bottom w:val="single" w:color="CBD5E1" w:sz="4"/>
+              <w:right w:val="single" w:color="CBD5E1" w:sz="4"/>
+            </w:tcBorders>
+            <w:shd w:fill="F8FAFC" w:val="clear"/>
+            <w:tcMar>
+              <w:top w:type="dxa" w:w="80"/>
+              <w:left w:type="dxa" w:w="140"/>
+              <w:bottom w:type="dxa" w:w="80"/>
+              <w:right w:type="dxa" w:w="140"/>
+            </w:tcMar>
+          </w:tcPr>
+          <w:p>
+            <w:r>
+              <w:rPr>
+                <w:rFonts w:ascii="Menlo" w:cs="Menlo" w:eastAsia="Menlo" w:hAnsi="Menlo"/>
+                <w:b/>
+                <w:bCs/>
+                <w:color w:val="0F172A"/>
+                <w:sz w:val="18"/>
+                <w:szCs w:val="18"/>
+              </w:rPr>
+              <w:t xml:space="preserve">What landed</w:t>
+            </w:r>
+          </w:p>
+        </w:tc>
+      </w:tr>
+      <w:tr>
+        <w:tc>
+          <w:tcPr>
+            <w:tcW w:type="dxa" w:w="3931"/>
+            <w:tcBorders>
+              <w:top w:val="single" w:color="CBD5E1" w:sz="4"/>
+              <w:left w:val="single" w:color="CBD5E1" w:sz="4"/>
+              <w:bottom w:val="single" w:color="CBD5E1" w:sz="4"/>
+              <w:right w:val="single" w:color="CBD5E1" w:sz="4"/>
+            </w:tcBorders>
+            <w:tcMar>
+              <w:top w:type="dxa" w:w="80"/>
+              <w:left w:type="dxa" w:w="140"/>
+              <w:bottom w:type="dxa" w:w="80"/>
+              <w:right w:type="dxa" w:w="140"/>
+            </w:tcMar>
+          </w:tcPr>
+          <w:p>
+            <w:r>
+              <w:rPr>
+                <w:rFonts w:ascii="Georgia" w:cs="Georgia" w:eastAsia="Georgia" w:hAnsi="Georgia"/>
+                <w:b/>
+                <w:bCs/>
+                <w:color w:val="0F172A"/>
+                <w:sz w:val="20"/>
+                <w:szCs w:val="20"/>
+              </w:rPr>
+              <w:t xml:space="preserve">4.1 AI-suggested frontmatter</w:t>
+            </w:r>
+          </w:p>
+        </w:tc>
+        <w:tc>
+          <w:tcPr>
+            <w:tcW w:type="dxa" w:w="5429"/>
+            <w:tcBorders>
+              <w:top w:val="single" w:color="CBD5E1" w:sz="4"/>
+              <w:left w:val="single" w:color="CBD5E1" w:sz="4"/>
+              <w:bottom w:val="single" w:color="CBD5E1" w:sz="4"/>
+              <w:right w:val="single" w:color="CBD5E1" w:sz="4"/>
+            </w:tcBorders>
+            <w:tcMar>
+              <w:top w:type="dxa" w:w="80"/>
+              <w:left w:type="dxa" w:w="140"/>
+              <w:bottom w:type="dxa" w:w="80"/>
+              <w:right w:type="dxa" w:w="140"/>
+            </w:tcMar>
+          </w:tcPr>
+          <w:p>
+            <w:r>
+              <w:rPr>
+                <w:rFonts w:ascii="Georgia" w:cs="Georgia" w:eastAsia="Georgia" w:hAnsi="Georgia"/>
+                <w:color w:val="0F172A"/>
+                <w:sz w:val="20"/>
+                <w:szCs w:val="20"/>
+              </w:rPr>
+              <w:t xml:space="preserve">New </w:t>
+            </w:r>
+            <w:r>
+              <w:rPr>
+                <w:rFonts w:ascii="Menlo" w:cs="Menlo" w:eastAsia="Menlo" w:hAnsi="Menlo"/>
+                <w:color w:val="B45309"/>
+                <w:sz w:val="20"/>
+                <w:szCs w:val="20"/>
+              </w:rPr>
+              <w:t xml:space="preserve">POST /api/studio/ai/frontmatter</w:t>
+            </w:r>
+            <w:r>
+              <w:rPr>
+                <w:rFonts w:ascii="Georgia" w:cs="Georgia" w:eastAsia="Georgia" w:hAnsi="Georgia"/>
+                <w:color w:val="0F172A"/>
+                <w:sz w:val="20"/>
+                <w:szCs w:val="20"/>
+              </w:rPr>
+              <w:t xml:space="preserve"> route — Claude Opus extended-thinking proposes </w:t>
+            </w:r>
+            <w:r>
+              <w:rPr>
+                <w:rFonts w:ascii="Menlo" w:cs="Menlo" w:eastAsia="Menlo" w:hAnsi="Menlo"/>
+                <w:color w:val="B45309"/>
+                <w:sz w:val="20"/>
+                <w:szCs w:val="20"/>
+              </w:rPr>
+              <w:t xml:space="preserve">{category, excerpt, tags}</w:t>
+            </w:r>
+            <w:r>
+              <w:rPr>
+                <w:rFonts w:ascii="Georgia" w:cs="Georgia" w:eastAsia="Georgia" w:hAnsi="Georgia"/>
+                <w:color w:val="0F172A"/>
+                <w:sz w:val="20"/>
+                <w:szCs w:val="20"/>
+              </w:rPr>
+              <w:t xml:space="preserve"> from the body (≥ 200 words required). Tighter token budget than Continue/Rewrite (1500 thinking, 512 output). "✨ Suggest frontmatter" pill in the editor surfaces a diff-style preview block (old → new with strike-through per field); "Apply all" overwrites the three fields + triggers autosave; "Dismiss" throws the suggestion away. Title and slug are intentionally never touched — the title is the author's voice.</w:t>
+            </w:r>
+          </w:p>
+        </w:tc>
+      </w:tr>
+      <w:tr>
+        <w:tc>
+          <w:tcPr>
+            <w:tcW w:type="dxa" w:w="3931"/>
+            <w:tcBorders>
+              <w:top w:val="single" w:color="CBD5E1" w:sz="4"/>
+              <w:left w:val="single" w:color="CBD5E1" w:sz="4"/>
+              <w:bottom w:val="single" w:color="CBD5E1" w:sz="4"/>
+              <w:right w:val="single" w:color="CBD5E1" w:sz="4"/>
+            </w:tcBorders>
+            <w:tcMar>
+              <w:top w:type="dxa" w:w="80"/>
+              <w:left w:type="dxa" w:w="140"/>
+              <w:bottom w:type="dxa" w:w="80"/>
+              <w:right w:type="dxa" w:w="140"/>
+            </w:tcMar>
+          </w:tcPr>
+          <w:p>
+            <w:r>
+              <w:rPr>
+                <w:rFonts w:ascii="Georgia" w:cs="Georgia" w:eastAsia="Georgia" w:hAnsi="Georgia"/>
+                <w:b/>
+                <w:bCs/>
+                <w:color w:val="0F172A"/>
+                <w:sz w:val="20"/>
+                <w:szCs w:val="20"/>
+              </w:rPr>
+              <w:t xml:space="preserve">4.2 Image upload</w:t>
+            </w:r>
+          </w:p>
+        </w:tc>
+        <w:tc>
+          <w:tcPr>
+            <w:tcW w:type="dxa" w:w="5429"/>
+            <w:tcBorders>
+              <w:top w:val="single" w:color="CBD5E1" w:sz="4"/>
+              <w:left w:val="single" w:color="CBD5E1" w:sz="4"/>
+              <w:bottom w:val="single" w:color="CBD5E1" w:sz="4"/>
+              <w:right w:val="single" w:color="CBD5E1" w:sz="4"/>
+            </w:tcBorders>
+            <w:tcMar>
+              <w:top w:type="dxa" w:w="80"/>
+              <w:left w:type="dxa" w:w="140"/>
+              <w:bottom w:type="dxa" w:w="80"/>
+              <w:right w:type="dxa" w:w="140"/>
+            </w:tcMar>
+          </w:tcPr>
+          <w:p>
+            <w:r>
+              <w:rPr>
+                <w:rFonts w:ascii="Georgia" w:cs="Georgia" w:eastAsia="Georgia" w:hAnsi="Georgia"/>
+                <w:color w:val="0F172A"/>
+                <w:sz w:val="20"/>
+                <w:szCs w:val="20"/>
+              </w:rPr>
+              <w:t xml:space="preserve">Supabase Storage bucket </w:t>
+            </w:r>
+            <w:r>
+              <w:rPr>
+                <w:rFonts w:ascii="Menlo" w:cs="Menlo" w:eastAsia="Menlo" w:hAnsi="Menlo"/>
+                <w:color w:val="B45309"/>
+                <w:sz w:val="20"/>
+                <w:szCs w:val="20"/>
+              </w:rPr>
+              <w:t xml:space="preserve">studio-uploads</w:t>
+            </w:r>
+            <w:r>
+              <w:rPr>
+                <w:rFonts w:ascii="Georgia" w:cs="Georgia" w:eastAsia="Georgia" w:hAnsi="Georgia"/>
+                <w:color w:val="0F172A"/>
+                <w:sz w:val="20"/>
+                <w:szCs w:val="20"/>
+              </w:rPr>
+              <w:t xml:space="preserve"> (public-read, 8 MiB limit, image MIMEs only). New </w:t>
+            </w:r>
+            <w:r>
+              <w:rPr>
+                <w:rFonts w:ascii="Menlo" w:cs="Menlo" w:eastAsia="Menlo" w:hAnsi="Menlo"/>
+                <w:color w:val="B45309"/>
+                <w:sz w:val="20"/>
+                <w:szCs w:val="20"/>
+              </w:rPr>
+              <w:t xml:space="preserve">POST /api/studio/upload</w:t>
+            </w:r>
+            <w:r>
+              <w:rPr>
+                <w:rFonts w:ascii="Georgia" w:cs="Georgia" w:eastAsia="Georgia" w:hAnsi="Georgia"/>
+                <w:color w:val="0F172A"/>
+                <w:sz w:val="20"/>
+                <w:szCs w:val="20"/>
+              </w:rPr>
+              <w:t xml:space="preserve"> route content-addresses uploads via sha256 (same bytes → same URL → no double-storage). Tiptap </w:t>
+            </w:r>
+            <w:r>
+              <w:rPr>
+                <w:rFonts w:ascii="Menlo" w:cs="Menlo" w:eastAsia="Menlo" w:hAnsi="Menlo"/>
+                <w:color w:val="B45309"/>
+                <w:sz w:val="20"/>
+                <w:szCs w:val="20"/>
+              </w:rPr>
+              <w:t xml:space="preserve">@tiptap/extension-image</w:t>
+            </w:r>
+            <w:r>
+              <w:rPr>
+                <w:rFonts w:ascii="Georgia" w:cs="Georgia" w:eastAsia="Georgia" w:hAnsi="Georgia"/>
+                <w:color w:val="0F172A"/>
+                <w:sz w:val="20"/>
+                <w:szCs w:val="20"/>
+              </w:rPr>
+              <w:t xml:space="preserve"> wired into the editor with native DOM listeners for drop / paste / click; upload status badge surfaces "uploading 1/3 hero.png" while in flight; CSS for </w:t>
+            </w:r>
+            <w:r>
+              <w:rPr>
+                <w:rFonts w:ascii="Menlo" w:cs="Menlo" w:eastAsia="Menlo" w:hAnsi="Menlo"/>
+                <w:color w:val="B45309"/>
+                <w:sz w:val="20"/>
+                <w:szCs w:val="20"/>
+              </w:rPr>
+              <w:t xml:space="preserve">.studio-prose img / .studio-image</w:t>
+            </w:r>
+            <w:r>
+              <w:rPr>
+                <w:rFonts w:ascii="Georgia" w:cs="Georgia" w:eastAsia="Georgia" w:hAnsi="Georgia"/>
+                <w:color w:val="0F172A"/>
+                <w:sz w:val="20"/>
+                <w:szCs w:val="20"/>
+              </w:rPr>
+              <w:t xml:space="preserve"> (centered, 12px radius, hairline border, copper outline on selection). Turndown handles </w:t>
+            </w:r>
+            <w:r>
+              <w:rPr>
+                <w:rFonts w:ascii="Menlo" w:cs="Menlo" w:eastAsia="Menlo" w:hAnsi="Menlo"/>
+                <w:color w:val="B45309"/>
+                <w:sz w:val="20"/>
+                <w:szCs w:val="20"/>
+              </w:rPr>
+              <w:t xml:space="preserve">&lt;img&gt;</w:t>
+            </w:r>
+            <w:r>
+              <w:rPr>
+                <w:rFonts w:ascii="Georgia" w:cs="Georgia" w:eastAsia="Georgia" w:hAnsi="Georgia"/>
+                <w:color w:val="0F172A"/>
+                <w:sz w:val="20"/>
+                <w:szCs w:val="20"/>
+              </w:rPr>
+              <w:t xml:space="preserve"> → </w:t>
+            </w:r>
+            <w:r>
+              <w:rPr>
+                <w:rFonts w:ascii="Menlo" w:cs="Menlo" w:eastAsia="Menlo" w:hAnsi="Menlo"/>
+                <w:color w:val="B45309"/>
+                <w:sz w:val="20"/>
+                <w:szCs w:val="20"/>
+              </w:rPr>
+              <w:t xml:space="preserve">![alt](url)</w:t>
+            </w:r>
+            <w:r>
+              <w:rPr>
+                <w:rFonts w:ascii="Georgia" w:cs="Georgia" w:eastAsia="Georgia" w:hAnsi="Georgia"/>
+                <w:color w:val="0F172A"/>
+                <w:sz w:val="20"/>
+                <w:szCs w:val="20"/>
+              </w:rPr>
+              <w:t xml:space="preserve"> on save; </w:t>
+            </w:r>
+            <w:r>
+              <w:rPr>
+                <w:rFonts w:ascii="Menlo" w:cs="Menlo" w:eastAsia="Menlo" w:hAnsi="Menlo"/>
+                <w:color w:val="B45309"/>
+                <w:sz w:val="20"/>
+                <w:szCs w:val="20"/>
+              </w:rPr>
+              <w:t xml:space="preserve">marked</w:t>
+            </w:r>
+            <w:r>
+              <w:rPr>
+                <w:rFonts w:ascii="Georgia" w:cs="Georgia" w:eastAsia="Georgia" w:hAnsi="Georgia"/>
+                <w:color w:val="0F172A"/>
+                <w:sz w:val="20"/>
+                <w:szCs w:val="20"/>
+              </w:rPr>
+              <w:t xml:space="preserve"> handles the inverse on load — no serializer changes needed.</w:t>
+            </w:r>
+          </w:p>
+        </w:tc>
+      </w:tr>
+    </w:tbl>
+    <w:p>
+      <w:pPr>
+        <w:spacing w:after="140" w:line="320"/>
+      </w:pPr>
+      <w:r>
+        <w:rPr>
+          <w:rFonts w:ascii="Georgia" w:cs="Georgia" w:eastAsia="Georgia" w:hAnsi="Georgia"/>
+          <w:b/>
+          <w:bCs/>
+          <w:color w:val="0F172A"/>
+          <w:sz w:val="22"/>
+          <w:szCs w:val="22"/>
+        </w:rPr>
+        <w:t xml:space="preserve">Live state (2026-05-14, code-complete):</w:t>
+      </w:r>
+    </w:p>
+    <w:p>
+      <w:pPr>
+        <w:pStyle w:val="ListParagraph"/>
+        <w:numPr>
+          <w:ilvl w:val="0"/>
+          <w:numId w:val="2"/>
+        </w:numPr>
+        <w:spacing w:after="80" w:line="300"/>
+      </w:pPr>
+      <w:r>
+        <w:rPr>
+          <w:rFonts w:ascii="Georgia" w:cs="Georgia" w:eastAsia="Georgia" w:hAnsi="Georgia"/>
+          <w:b/>
+          <w:bCs/>
+          <w:color w:val="0F172A"/>
+          <w:sz w:val="22"/>
+          <w:szCs w:val="22"/>
+        </w:rPr>
+        <w:t xml:space="preserve">Env vars on Vercel (`tarrysingh-com-zdmb`):</w:t>
+      </w:r>
+      <w:r>
+        <w:rPr>
+          <w:rFonts w:ascii="Georgia" w:cs="Georgia" w:eastAsia="Georgia" w:hAnsi="Georgia"/>
+          <w:color w:val="0F172A"/>
+          <w:sz w:val="22"/>
+          <w:szCs w:val="22"/>
+        </w:rPr>
+        <w:t xml:space="preserve"> </w:t>
+      </w:r>
+      <w:r>
+        <w:rPr>
+          <w:rFonts w:ascii="Menlo" w:cs="Menlo" w:eastAsia="Menlo" w:hAnsi="Menlo"/>
+          <w:color w:val="B45309"/>
+          <w:sz w:val="20"/>
+          <w:szCs w:val="20"/>
+        </w:rPr>
+        <w:t xml:space="preserve">STUDIO_UPLOADS_BUCKET=studio-uploads</w:t>
+      </w:r>
+      <w:r>
+        <w:rPr>
+          <w:rFonts w:ascii="Georgia" w:cs="Georgia" w:eastAsia="Georgia" w:hAnsi="Georgia"/>
+          <w:color w:val="0F172A"/>
+          <w:sz w:val="22"/>
+          <w:szCs w:val="22"/>
+        </w:rPr>
+        <w:t xml:space="preserve"> (optional — defaults work).</w:t>
+      </w:r>
+    </w:p>
+    <w:p>
+      <w:pPr>
+        <w:pStyle w:val="ListParagraph"/>
+        <w:numPr>
+          <w:ilvl w:val="0"/>
+          <w:numId w:val="2"/>
+        </w:numPr>
+        <w:spacing w:after="80" w:line="300"/>
+      </w:pPr>
+      <w:r>
+        <w:rPr>
+          <w:rFonts w:ascii="Georgia" w:cs="Georgia" w:eastAsia="Georgia" w:hAnsi="Georgia"/>
+          <w:b/>
+          <w:bCs/>
+          <w:color w:val="0F172A"/>
+          <w:sz w:val="22"/>
+          <w:szCs w:val="22"/>
+        </w:rPr>
+        <w:t xml:space="preserve">Supabase migration:</w:t>
+      </w:r>
+      <w:r>
+        <w:rPr>
+          <w:rFonts w:ascii="Georgia" w:cs="Georgia" w:eastAsia="Georgia" w:hAnsi="Georgia"/>
+          <w:color w:val="0F172A"/>
+          <w:sz w:val="22"/>
+          <w:szCs w:val="22"/>
+        </w:rPr>
+        <w:t xml:space="preserve"> </w:t>
+      </w:r>
+      <w:hyperlink w:history="1" r:id="rIdclswxvkjjgix-ks9ovgbb">
+        <w:r>
+          <w:rPr>
+            <w:rFonts w:ascii="Georgia" w:cs="Georgia" w:eastAsia="Georgia" w:hAnsi="Georgia"/>
+            <w:color w:val="1D4ED8"/>
+            <w:sz w:val="22"/>
+            <w:szCs w:val="22"/>
+            <w:u w:val="single"/>
+          </w:rPr>
+          <w:t xml:space="preserve">`2026-05-14-studio-uploads-bucket.sql`</w:t>
+        </w:r>
+      </w:hyperlink>
+      <w:r>
+        <w:rPr>
+          <w:rFonts w:ascii="Georgia" w:cs="Georgia" w:eastAsia="Georgia" w:hAnsi="Georgia"/>
+          <w:color w:val="0F172A"/>
+          <w:sz w:val="22"/>
+          <w:szCs w:val="22"/>
+        </w:rPr>
+        <w:t xml:space="preserve"> applied to </w:t>
+      </w:r>
+      <w:r>
+        <w:rPr>
+          <w:rFonts w:ascii="Menlo" w:cs="Menlo" w:eastAsia="Menlo" w:hAnsi="Menlo"/>
+          <w:color w:val="B45309"/>
+          <w:sz w:val="20"/>
+          <w:szCs w:val="20"/>
+        </w:rPr>
+        <w:t xml:space="preserve">agentify</w:t>
+      </w:r>
+      <w:r>
+        <w:rPr>
+          <w:rFonts w:ascii="Georgia" w:cs="Georgia" w:eastAsia="Georgia" w:hAnsi="Georgia"/>
+          <w:color w:val="0F172A"/>
+          <w:sz w:val="22"/>
+          <w:szCs w:val="22"/>
+        </w:rPr>
+        <w:t xml:space="preserve">. Bucket verified.</w:t>
+      </w:r>
+    </w:p>
+    <w:p>
+      <w:pPr>
+        <w:pStyle w:val="ListParagraph"/>
+        <w:numPr>
+          <w:ilvl w:val="0"/>
+          <w:numId w:val="2"/>
+        </w:numPr>
+        <w:spacing w:after="80" w:line="300"/>
+      </w:pPr>
+      <w:r>
+        <w:rPr>
+          <w:rFonts w:ascii="Georgia" w:cs="Georgia" w:eastAsia="Georgia" w:hAnsi="Georgia"/>
+          <w:b/>
+          <w:bCs/>
+          <w:color w:val="0F172A"/>
+          <w:sz w:val="22"/>
+          <w:szCs w:val="22"/>
+        </w:rPr>
+        <w:t xml:space="preserve">`next build` passes</w:t>
+      </w:r>
+      <w:r>
+        <w:rPr>
+          <w:rFonts w:ascii="Georgia" w:cs="Georgia" w:eastAsia="Georgia" w:hAnsi="Georgia"/>
+          <w:color w:val="0F172A"/>
+          <w:sz w:val="22"/>
+          <w:szCs w:val="22"/>
+        </w:rPr>
+        <w:t xml:space="preserve"> with </w:t>
+      </w:r>
+      <w:r>
+        <w:rPr>
+          <w:rFonts w:ascii="Menlo" w:cs="Menlo" w:eastAsia="Menlo" w:hAnsi="Menlo"/>
+          <w:color w:val="B45309"/>
+          <w:sz w:val="20"/>
+          <w:szCs w:val="20"/>
+        </w:rPr>
+        <w:t xml:space="preserve">/api/studio/ai/frontmatter</w:t>
+      </w:r>
+      <w:r>
+        <w:rPr>
+          <w:rFonts w:ascii="Georgia" w:cs="Georgia" w:eastAsia="Georgia" w:hAnsi="Georgia"/>
+          <w:color w:val="0F172A"/>
+          <w:sz w:val="22"/>
+          <w:szCs w:val="22"/>
+        </w:rPr>
+        <w:t xml:space="preserve"> and </w:t>
+      </w:r>
+      <w:r>
+        <w:rPr>
+          <w:rFonts w:ascii="Menlo" w:cs="Menlo" w:eastAsia="Menlo" w:hAnsi="Menlo"/>
+          <w:color w:val="B45309"/>
+          <w:sz w:val="20"/>
+          <w:szCs w:val="20"/>
+        </w:rPr>
+        <w:t xml:space="preserve">/api/studio/upload</w:t>
+      </w:r>
+      <w:r>
+        <w:rPr>
+          <w:rFonts w:ascii="Georgia" w:cs="Georgia" w:eastAsia="Georgia" w:hAnsi="Georgia"/>
+          <w:color w:val="0F172A"/>
+          <w:sz w:val="22"/>
+          <w:szCs w:val="22"/>
+        </w:rPr>
+        <w:t xml:space="preserve"> in the routes list.</w:t>
+      </w:r>
+    </w:p>
+    <w:p>
+      <w:pPr>
+        <w:pStyle w:val="ListParagraph"/>
+        <w:numPr>
+          <w:ilvl w:val="0"/>
+          <w:numId w:val="2"/>
+        </w:numPr>
+        <w:spacing w:after="80" w:line="300"/>
+      </w:pPr>
+      <w:r>
+        <w:rPr>
+          <w:rFonts w:ascii="Georgia" w:cs="Georgia" w:eastAsia="Georgia" w:hAnsi="Georgia"/>
+          <w:b/>
+          <w:bCs/>
+          <w:color w:val="0F172A"/>
+          <w:sz w:val="22"/>
+          <w:szCs w:val="22"/>
+        </w:rPr>
+        <w:t xml:space="preserve">Pending Tarry-side UAT:</w:t>
+      </w:r>
+      <w:r>
+        <w:rPr>
+          <w:rFonts w:ascii="Georgia" w:cs="Georgia" w:eastAsia="Georgia" w:hAnsi="Georgia"/>
+          <w:color w:val="0F172A"/>
+          <w:sz w:val="22"/>
+          <w:szCs w:val="22"/>
+        </w:rPr>
+        <w:t xml:space="preserve"> end-to-end upload via the editor (drop, paste, click) plus AI-suggested frontmatter on a real Dispatch.</w:t>
       </w:r>
     </w:p>
     <w:p>
@@ -13929,7 +14566,7 @@
                 <w:sz w:val="20"/>
                 <w:szCs w:val="20"/>
               </w:rPr>
-              <w:t xml:space="preserve">Studio Editor Supabase migration</w:t>
+              <w:t xml:space="preserve">Studio Editor Supabase migration (drafts)</w:t>
             </w:r>
           </w:p>
         </w:tc>
@@ -13987,7 +14624,7 @@
                 <w:sz w:val="20"/>
                 <w:szCs w:val="20"/>
               </w:rPr>
-              <w:t xml:space="preserve">Sprint 3 UAT plan + results</w:t>
+              <w:t xml:space="preserve">Studio uploads bucket migration (Sprint 4.2)</w:t>
             </w:r>
           </w:p>
         </w:tc>
@@ -14015,17 +14652,57 @@
                 <w:sz w:val="20"/>
                 <w:szCs w:val="20"/>
               </w:rPr>
-              <w:t xml:space="preserve">docs/reports/sprint-3-uat-plan.md</w:t>
-            </w:r>
-            <w:r>
-              <w:rPr>
-                <w:rFonts w:ascii="Georgia" w:cs="Georgia" w:eastAsia="Georgia" w:hAnsi="Georgia"/>
-                <w:color w:val="0F172A"/>
-                <w:sz w:val="20"/>
-                <w:szCs w:val="20"/>
-              </w:rPr>
-              <w:t xml:space="preserve">, </w:t>
-            </w:r>
+              <w:t xml:space="preserve">docs/migrations/2026-05-14-studio-uploads-bucket.sql</w:t>
+            </w:r>
+          </w:p>
+        </w:tc>
+      </w:tr>
+      <w:tr>
+        <w:tc>
+          <w:tcPr>
+            <w:tcW w:type="dxa" w:w="3931"/>
+            <w:tcBorders>
+              <w:top w:val="single" w:color="CBD5E1" w:sz="4"/>
+              <w:left w:val="single" w:color="CBD5E1" w:sz="4"/>
+              <w:bottom w:val="single" w:color="CBD5E1" w:sz="4"/>
+              <w:right w:val="single" w:color="CBD5E1" w:sz="4"/>
+            </w:tcBorders>
+            <w:tcMar>
+              <w:top w:type="dxa" w:w="80"/>
+              <w:left w:type="dxa" w:w="140"/>
+              <w:bottom w:type="dxa" w:w="80"/>
+              <w:right w:type="dxa" w:w="140"/>
+            </w:tcMar>
+          </w:tcPr>
+          <w:p>
+            <w:r>
+              <w:rPr>
+                <w:rFonts w:ascii="Georgia" w:cs="Georgia" w:eastAsia="Georgia" w:hAnsi="Georgia"/>
+                <w:color w:val="0F172A"/>
+                <w:sz w:val="20"/>
+                <w:szCs w:val="20"/>
+              </w:rPr>
+              <w:t xml:space="preserve">Sprint 3 UAT plan + results</w:t>
+            </w:r>
+          </w:p>
+        </w:tc>
+        <w:tc>
+          <w:tcPr>
+            <w:tcW w:type="dxa" w:w="5429"/>
+            <w:tcBorders>
+              <w:top w:val="single" w:color="CBD5E1" w:sz="4"/>
+              <w:left w:val="single" w:color="CBD5E1" w:sz="4"/>
+              <w:bottom w:val="single" w:color="CBD5E1" w:sz="4"/>
+              <w:right w:val="single" w:color="CBD5E1" w:sz="4"/>
+            </w:tcBorders>
+            <w:tcMar>
+              <w:top w:type="dxa" w:w="80"/>
+              <w:left w:type="dxa" w:w="140"/>
+              <w:bottom w:type="dxa" w:w="80"/>
+              <w:right w:type="dxa" w:w="140"/>
+            </w:tcMar>
+          </w:tcPr>
+          <w:p>
             <w:r>
               <w:rPr>
                 <w:rFonts w:ascii="Menlo" w:cs="Menlo" w:eastAsia="Menlo" w:hAnsi="Menlo"/>
@@ -14033,7 +14710,159 @@
                 <w:sz w:val="20"/>
                 <w:szCs w:val="20"/>
               </w:rPr>
+              <w:t xml:space="preserve">docs/reports/sprint-3-uat-plan.md</w:t>
+            </w:r>
+            <w:r>
+              <w:rPr>
+                <w:rFonts w:ascii="Georgia" w:cs="Georgia" w:eastAsia="Georgia" w:hAnsi="Georgia"/>
+                <w:color w:val="0F172A"/>
+                <w:sz w:val="20"/>
+                <w:szCs w:val="20"/>
+              </w:rPr>
+              <w:t xml:space="preserve">, </w:t>
+            </w:r>
+            <w:r>
+              <w:rPr>
+                <w:rFonts w:ascii="Menlo" w:cs="Menlo" w:eastAsia="Menlo" w:hAnsi="Menlo"/>
+                <w:color w:val="B45309"/>
+                <w:sz w:val="20"/>
+                <w:szCs w:val="20"/>
+              </w:rPr>
               <w:t xml:space="preserve">docs/reports/sprint-3-uat-results.md</w:t>
+            </w:r>
+          </w:p>
+        </w:tc>
+      </w:tr>
+      <w:tr>
+        <w:tc>
+          <w:tcPr>
+            <w:tcW w:type="dxa" w:w="3931"/>
+            <w:tcBorders>
+              <w:top w:val="single" w:color="CBD5E1" w:sz="4"/>
+              <w:left w:val="single" w:color="CBD5E1" w:sz="4"/>
+              <w:bottom w:val="single" w:color="CBD5E1" w:sz="4"/>
+              <w:right w:val="single" w:color="CBD5E1" w:sz="4"/>
+            </w:tcBorders>
+            <w:tcMar>
+              <w:top w:type="dxa" w:w="80"/>
+              <w:left w:type="dxa" w:w="140"/>
+              <w:bottom w:type="dxa" w:w="80"/>
+              <w:right w:type="dxa" w:w="140"/>
+            </w:tcMar>
+          </w:tcPr>
+          <w:p>
+            <w:r>
+              <w:rPr>
+                <w:rFonts w:ascii="Georgia" w:cs="Georgia" w:eastAsia="Georgia" w:hAnsi="Georgia"/>
+                <w:color w:val="0F172A"/>
+                <w:sz w:val="20"/>
+                <w:szCs w:val="20"/>
+              </w:rPr>
+              <w:t xml:space="preserve">AI-suggested frontmatter (Sprint 4.1)</w:t>
+            </w:r>
+          </w:p>
+        </w:tc>
+        <w:tc>
+          <w:tcPr>
+            <w:tcW w:type="dxa" w:w="5429"/>
+            <w:tcBorders>
+              <w:top w:val="single" w:color="CBD5E1" w:sz="4"/>
+              <w:left w:val="single" w:color="CBD5E1" w:sz="4"/>
+              <w:bottom w:val="single" w:color="CBD5E1" w:sz="4"/>
+              <w:right w:val="single" w:color="CBD5E1" w:sz="4"/>
+            </w:tcBorders>
+            <w:tcMar>
+              <w:top w:type="dxa" w:w="80"/>
+              <w:left w:type="dxa" w:w="140"/>
+              <w:bottom w:type="dxa" w:w="80"/>
+              <w:right w:type="dxa" w:w="140"/>
+            </w:tcMar>
+          </w:tcPr>
+          <w:p>
+            <w:r>
+              <w:rPr>
+                <w:rFonts w:ascii="Menlo" w:cs="Menlo" w:eastAsia="Menlo" w:hAnsi="Menlo"/>
+                <w:color w:val="B45309"/>
+                <w:sz w:val="20"/>
+                <w:szCs w:val="20"/>
+              </w:rPr>
+              <w:t xml:space="preserve">src/lib/studio/ai.ts:aiFrontmatter</w:t>
+            </w:r>
+            <w:r>
+              <w:rPr>
+                <w:rFonts w:ascii="Georgia" w:cs="Georgia" w:eastAsia="Georgia" w:hAnsi="Georgia"/>
+                <w:color w:val="0F172A"/>
+                <w:sz w:val="20"/>
+                <w:szCs w:val="20"/>
+              </w:rPr>
+              <w:t xml:space="preserve">, </w:t>
+            </w:r>
+            <w:r>
+              <w:rPr>
+                <w:rFonts w:ascii="Menlo" w:cs="Menlo" w:eastAsia="Menlo" w:hAnsi="Menlo"/>
+                <w:color w:val="B45309"/>
+                <w:sz w:val="20"/>
+                <w:szCs w:val="20"/>
+              </w:rPr>
+              <w:t xml:space="preserve">src/app/api/studio/ai/frontmatter/route.ts</w:t>
+            </w:r>
+          </w:p>
+        </w:tc>
+      </w:tr>
+      <w:tr>
+        <w:tc>
+          <w:tcPr>
+            <w:tcW w:type="dxa" w:w="3931"/>
+            <w:tcBorders>
+              <w:top w:val="single" w:color="CBD5E1" w:sz="4"/>
+              <w:left w:val="single" w:color="CBD5E1" w:sz="4"/>
+              <w:bottom w:val="single" w:color="CBD5E1" w:sz="4"/>
+              <w:right w:val="single" w:color="CBD5E1" w:sz="4"/>
+            </w:tcBorders>
+            <w:tcMar>
+              <w:top w:type="dxa" w:w="80"/>
+              <w:left w:type="dxa" w:w="140"/>
+              <w:bottom w:type="dxa" w:w="80"/>
+              <w:right w:type="dxa" w:w="140"/>
+            </w:tcMar>
+          </w:tcPr>
+          <w:p>
+            <w:r>
+              <w:rPr>
+                <w:rFonts w:ascii="Georgia" w:cs="Georgia" w:eastAsia="Georgia" w:hAnsi="Georgia"/>
+                <w:color w:val="0F172A"/>
+                <w:sz w:val="20"/>
+                <w:szCs w:val="20"/>
+              </w:rPr>
+              <w:t xml:space="preserve">Image upload route (Sprint 4.2)</w:t>
+            </w:r>
+          </w:p>
+        </w:tc>
+        <w:tc>
+          <w:tcPr>
+            <w:tcW w:type="dxa" w:w="5429"/>
+            <w:tcBorders>
+              <w:top w:val="single" w:color="CBD5E1" w:sz="4"/>
+              <w:left w:val="single" w:color="CBD5E1" w:sz="4"/>
+              <w:bottom w:val="single" w:color="CBD5E1" w:sz="4"/>
+              <w:right w:val="single" w:color="CBD5E1" w:sz="4"/>
+            </w:tcBorders>
+            <w:tcMar>
+              <w:top w:type="dxa" w:w="80"/>
+              <w:left w:type="dxa" w:w="140"/>
+              <w:bottom w:type="dxa" w:w="80"/>
+              <w:right w:type="dxa" w:w="140"/>
+            </w:tcMar>
+          </w:tcPr>
+          <w:p>
+            <w:r>
+              <w:rPr>
+                <w:rFonts w:ascii="Menlo" w:cs="Menlo" w:eastAsia="Menlo" w:hAnsi="Menlo"/>
+                <w:color w:val="B45309"/>
+                <w:sz w:val="20"/>
+                <w:szCs w:val="20"/>
+              </w:rPr>
+              <w:t xml:space="preserve">src/app/api/studio/upload/route.ts</w:t>
             </w:r>
           </w:p>
         </w:tc>
@@ -14827,6 +15656,146 @@
                 <w:szCs w:val="20"/>
               </w:rPr>
               <w:t xml:space="preserve">Tarry Singh ✓ Stage B (2026-05-14) · Claude ✓ Stage A (2026-05-13)</w:t>
+            </w:r>
+          </w:p>
+        </w:tc>
+      </w:tr>
+      <w:tr>
+        <w:tc>
+          <w:tcPr>
+            <w:tcW w:type="dxa" w:w="3370"/>
+            <w:tcBorders>
+              <w:top w:val="single" w:color="CBD5E1" w:sz="4"/>
+              <w:left w:val="single" w:color="CBD5E1" w:sz="4"/>
+              <w:bottom w:val="single" w:color="CBD5E1" w:sz="4"/>
+              <w:right w:val="single" w:color="CBD5E1" w:sz="4"/>
+            </w:tcBorders>
+            <w:tcMar>
+              <w:top w:type="dxa" w:w="80"/>
+              <w:left w:type="dxa" w:w="140"/>
+              <w:bottom w:type="dxa" w:w="80"/>
+              <w:right w:type="dxa" w:w="140"/>
+            </w:tcMar>
+          </w:tcPr>
+          <w:p>
+            <w:r>
+              <w:rPr>
+                <w:rFonts w:ascii="Georgia" w:cs="Georgia" w:eastAsia="Georgia" w:hAnsi="Georgia"/>
+                <w:color w:val="0F172A"/>
+                <w:sz w:val="20"/>
+                <w:szCs w:val="20"/>
+              </w:rPr>
+              <w:t xml:space="preserve">Sprint 4 — AI-suggested frontmatter + image upload</w:t>
+            </w:r>
+          </w:p>
+        </w:tc>
+        <w:tc>
+          <w:tcPr>
+            <w:tcW w:type="dxa" w:w="4305"/>
+            <w:tcBorders>
+              <w:top w:val="single" w:color="CBD5E1" w:sz="4"/>
+              <w:left w:val="single" w:color="CBD5E1" w:sz="4"/>
+              <w:bottom w:val="single" w:color="CBD5E1" w:sz="4"/>
+              <w:right w:val="single" w:color="CBD5E1" w:sz="4"/>
+            </w:tcBorders>
+            <w:tcMar>
+              <w:top w:type="dxa" w:w="80"/>
+              <w:left w:type="dxa" w:w="140"/>
+              <w:bottom w:type="dxa" w:w="80"/>
+              <w:right w:type="dxa" w:w="140"/>
+            </w:tcMar>
+          </w:tcPr>
+          <w:p>
+            <w:r>
+              <w:rPr>
+                <w:rFonts w:ascii="Georgia" w:cs="Georgia" w:eastAsia="Georgia" w:hAnsi="Georgia"/>
+                <w:color w:val="0F172A"/>
+                <w:sz w:val="20"/>
+                <w:szCs w:val="20"/>
+              </w:rPr>
+              <w:t xml:space="preserve">code-complete 2026-05-14 — 7 commits on </w:t>
+            </w:r>
+            <w:r>
+              <w:rPr>
+                <w:rFonts w:ascii="Menlo" w:cs="Menlo" w:eastAsia="Menlo" w:hAnsi="Menlo"/>
+                <w:color w:val="B45309"/>
+                <w:sz w:val="20"/>
+                <w:szCs w:val="20"/>
+              </w:rPr>
+              <w:t xml:space="preserve">claude/sprint-4</w:t>
+            </w:r>
+            <w:r>
+              <w:rPr>
+                <w:rFonts w:ascii="Georgia" w:cs="Georgia" w:eastAsia="Georgia" w:hAnsi="Georgia"/>
+                <w:color w:val="0F172A"/>
+                <w:sz w:val="20"/>
+                <w:szCs w:val="20"/>
+              </w:rPr>
+              <w:t xml:space="preserve">; Supabase Storage bucket applied; </w:t>
+            </w:r>
+            <w:r>
+              <w:rPr>
+                <w:rFonts w:ascii="Menlo" w:cs="Menlo" w:eastAsia="Menlo" w:hAnsi="Menlo"/>
+                <w:color w:val="B45309"/>
+                <w:sz w:val="20"/>
+                <w:szCs w:val="20"/>
+              </w:rPr>
+              <w:t xml:space="preserve">next build</w:t>
+            </w:r>
+            <w:r>
+              <w:rPr>
+                <w:rFonts w:ascii="Georgia" w:cs="Georgia" w:eastAsia="Georgia" w:hAnsi="Georgia"/>
+                <w:color w:val="0F172A"/>
+                <w:sz w:val="20"/>
+                <w:szCs w:val="20"/>
+              </w:rPr>
+              <w:t xml:space="preserve"> green; AI frontmatter route + Suggest pill in editor; drop/paste/click upload through </w:t>
+            </w:r>
+            <w:r>
+              <w:rPr>
+                <w:rFonts w:ascii="Menlo" w:cs="Menlo" w:eastAsia="Menlo" w:hAnsi="Menlo"/>
+                <w:color w:val="B45309"/>
+                <w:sz w:val="20"/>
+                <w:szCs w:val="20"/>
+              </w:rPr>
+              <w:t xml:space="preserve">/api/studio/upload</w:t>
+            </w:r>
+            <w:r>
+              <w:rPr>
+                <w:rFonts w:ascii="Georgia" w:cs="Georgia" w:eastAsia="Georgia" w:hAnsi="Georgia"/>
+                <w:color w:val="0F172A"/>
+                <w:sz w:val="20"/>
+                <w:szCs w:val="20"/>
+              </w:rPr>
+              <w:t xml:space="preserve">; Sprint 5 next</w:t>
+            </w:r>
+          </w:p>
+        </w:tc>
+        <w:tc>
+          <w:tcPr>
+            <w:tcW w:type="dxa" w:w="1685"/>
+            <w:tcBorders>
+              <w:top w:val="single" w:color="CBD5E1" w:sz="4"/>
+              <w:left w:val="single" w:color="CBD5E1" w:sz="4"/>
+              <w:bottom w:val="single" w:color="CBD5E1" w:sz="4"/>
+              <w:right w:val="single" w:color="CBD5E1" w:sz="4"/>
+            </w:tcBorders>
+            <w:tcMar>
+              <w:top w:type="dxa" w:w="80"/>
+              <w:left w:type="dxa" w:w="140"/>
+              <w:bottom w:type="dxa" w:w="80"/>
+              <w:right w:type="dxa" w:w="140"/>
+            </w:tcMar>
+          </w:tcPr>
+          <w:p>
+            <w:r>
+              <w:rPr>
+                <w:rFonts w:ascii="Georgia" w:cs="Georgia" w:eastAsia="Georgia" w:hAnsi="Georgia"/>
+                <w:color w:val="0F172A"/>
+                <w:sz w:val="20"/>
+                <w:szCs w:val="20"/>
+              </w:rPr>
+              <w:t xml:space="preserve">technical-side complete; pending Tarry-side UAT</w:t>
             </w:r>
           </w:p>
         </w:tc>

</xml_diff>

<commit_message>
docs(reports): Sprint 5 close — roadmap "shipped" + status report row + env
Sprint 5 code-complete 2026-05-14.

- .env.example: REPLICATE_API_TOKEN (required) + four optional
  STUDIO_IMAGE_GEN_* overrides documented inline.
- sprint-4-plus-roadmap.md: header date bumped; Sprint 5 sequence
  row crossed out + linked to a new "Sprint 5 — shipped 2026-05-14"
  section that walks the four commits (prompt synth → adapter →
  chained route → UI), names the live env vars, lists deliberate
  non-goals.
- dispatches-status-report.md: new Sprint 5 sub-section in the
  history table (layer-by-layer breakdown); sign-off row added;
  glossary updated with the new lib + route paths.
- Status report .docx regenerated.

Pending Tarry-side: REPLICATE_API_TOKEN on the Vercel project,
then click "✨ Generate hero" on a real draft + UAT the four
follow-up buttons (Use it / Regenerate / Edit prompt / Dismiss).

Co-Authored-By: Claude Opus 4.7 (1M context) <noreply@anthropic.com>
</commit_message>
<xml_diff>
--- a/docs/reports/dispatches-status-report.docx
+++ b/docs/reports/dispatches-status-report.docx
@@ -61,7 +61,25 @@
           <w:sz w:val="22"/>
           <w:szCs w:val="22"/>
         </w:rPr>
-        <w:t xml:space="preserve"> 2026-05-14 (Sprint 4 code-complete — AI-suggested frontmatter + image upload to Supabase Storage; awaiting Tarry-side UAT) </w:t>
+        <w:t xml:space="preserve"> 2026-05-14 (Sprint 4 + Sprint 5 both code-complete — AI-suggested frontmatter · image upload · AI-rendered hero images; awaiting Tarry-side UAT + </w:t>
+      </w:r>
+      <w:r>
+        <w:rPr>
+          <w:rFonts w:ascii="Menlo" w:cs="Menlo" w:eastAsia="Menlo" w:hAnsi="Menlo"/>
+          <w:color w:val="B45309"/>
+          <w:sz w:val="20"/>
+          <w:szCs w:val="20"/>
+        </w:rPr>
+        <w:t xml:space="preserve">REPLICATE_API_TOKEN</w:t>
+      </w:r>
+      <w:r>
+        <w:rPr>
+          <w:rFonts w:ascii="Georgia" w:cs="Georgia" w:eastAsia="Georgia" w:hAnsi="Georgia"/>
+          <w:color w:val="0F172A"/>
+          <w:sz w:val="22"/>
+          <w:szCs w:val="22"/>
+        </w:rPr>
+        <w:t xml:space="preserve"> env) </w:t>
       </w:r>
       <w:r>
         <w:rPr>
@@ -103,7 +121,7 @@
         </w:rPr>
         <w:t xml:space="preserve"> </w:t>
       </w:r>
-      <w:hyperlink w:history="1" r:id="rIdb8mv4fcf5yd6wh2fep2jl">
+      <w:hyperlink w:history="1" r:id="rIdhqkz6dda-xjpsyxno_0yl">
         <w:r>
           <w:rPr>
             <w:rFonts w:ascii="Georgia" w:cs="Georgia" w:eastAsia="Georgia" w:hAnsi="Georgia"/>
@@ -3072,7 +3090,7 @@
         </w:rPr>
         <w:t xml:space="preserve">) is live at </w:t>
       </w:r>
-      <w:hyperlink w:history="1" r:id="rId0sonfmyuoz6-viyzqglum">
+      <w:hyperlink w:history="1" r:id="rIdajoiidhhor5vwdxkdwenb">
         <w:r>
           <w:rPr>
             <w:rFonts w:ascii="Georgia" w:cs="Georgia" w:eastAsia="Georgia" w:hAnsi="Georgia"/>
@@ -3419,7 +3437,7 @@
         </w:rPr>
         <w:t xml:space="preserve"> </w:t>
       </w:r>
-      <w:hyperlink w:history="1" r:id="rIdwkf60j4cqhp5oqggzkox8">
+      <w:hyperlink w:history="1" r:id="rIdb6c0xwmn8z8mctqxmwaox">
         <w:r>
           <w:rPr>
             <w:rFonts w:ascii="Georgia" w:cs="Georgia" w:eastAsia="Georgia" w:hAnsi="Georgia"/>
@@ -3440,7 +3458,7 @@
         </w:rPr>
         <w:t xml:space="preserve"> · </w:t>
       </w:r>
-      <w:hyperlink w:history="1" r:id="rId7t4q22tfk3d877gwrvzzh">
+      <w:hyperlink w:history="1" r:id="rIdvtwmay6fn6qge94fa56-k">
         <w:r>
           <w:rPr>
             <w:rFonts w:ascii="Georgia" w:cs="Georgia" w:eastAsia="Georgia" w:hAnsi="Georgia"/>
@@ -3572,7 +3590,7 @@
         </w:rPr>
         <w:t xml:space="preserve">These items are sequenced and sized in </w:t>
       </w:r>
-      <w:hyperlink w:history="1" r:id="rIdxtekz9ks9_lwrs4ywphxy">
+      <w:hyperlink w:history="1" r:id="rIdyp3yyiyj8wwg_vuzjlw9x">
         <w:r>
           <w:rPr>
             <w:rFonts w:ascii="Georgia" w:cs="Georgia" w:eastAsia="Georgia" w:hAnsi="Georgia"/>
@@ -4113,7 +4131,7 @@
         </w:rPr>
         <w:t xml:space="preserve"> </w:t>
       </w:r>
-      <w:hyperlink w:history="1" r:id="rIdclswxvkjjgix-ks9ovgbb">
+      <w:hyperlink w:history="1" r:id="rIdty7c33ht7oy9mow05voda">
         <w:r>
           <w:rPr>
             <w:rFonts w:ascii="Georgia" w:cs="Georgia" w:eastAsia="Georgia" w:hAnsi="Georgia"/>
@@ -4247,6 +4265,1032 @@
           <w:szCs w:val="22"/>
         </w:rPr>
         <w:t xml:space="preserve"> end-to-end upload via the editor (drop, paste, click) plus AI-suggested frontmatter on a real Dispatch.</w:t>
+      </w:r>
+    </w:p>
+    <w:p>
+      <w:pPr>
+        <w:pStyle w:val="Heading3"/>
+        <w:spacing w:after="120" w:before="220"/>
+      </w:pPr>
+      <w:r>
+        <w:rPr>
+          <w:rFonts w:ascii="Georgia" w:cs="Georgia" w:eastAsia="Georgia" w:hAnsi="Georgia"/>
+          <w:b/>
+          <w:bCs/>
+          <w:color w:val="0F172A"/>
+          <w:sz w:val="26"/>
+          <w:szCs w:val="26"/>
+        </w:rPr>
+        <w:t xml:space="preserve">Sprint 5 — AI-rendered hero images (code-complete 2026-05-14)</w:t>
+      </w:r>
+    </w:p>
+    <w:p>
+      <w:pPr>
+        <w:spacing w:after="140" w:line="320"/>
+      </w:pPr>
+      <w:r>
+        <w:rPr>
+          <w:rFonts w:ascii="Georgia" w:cs="Georgia" w:eastAsia="Georgia" w:hAnsi="Georgia"/>
+          <w:b/>
+          <w:bCs/>
+          <w:color w:val="0F172A"/>
+          <w:sz w:val="22"/>
+          <w:szCs w:val="22"/>
+        </w:rPr>
+        <w:t xml:space="preserve">Window:</w:t>
+      </w:r>
+      <w:r>
+        <w:rPr>
+          <w:rFonts w:ascii="Georgia" w:cs="Georgia" w:eastAsia="Georgia" w:hAnsi="Georgia"/>
+          <w:color w:val="0F172A"/>
+          <w:sz w:val="22"/>
+          <w:szCs w:val="22"/>
+        </w:rPr>
+        <w:t xml:space="preserve"> 2026-05-14, same afternoon as Sprint 4. Branch </w:t>
+      </w:r>
+      <w:r>
+        <w:rPr>
+          <w:rFonts w:ascii="Menlo" w:cs="Menlo" w:eastAsia="Menlo" w:hAnsi="Menlo"/>
+          <w:color w:val="B45309"/>
+          <w:sz w:val="20"/>
+          <w:szCs w:val="20"/>
+        </w:rPr>
+        <w:t xml:space="preserve">claude/sprint-5</w:t>
+      </w:r>
+      <w:r>
+        <w:rPr>
+          <w:rFonts w:ascii="Georgia" w:cs="Georgia" w:eastAsia="Georgia" w:hAnsi="Georgia"/>
+          <w:color w:val="0F172A"/>
+          <w:sz w:val="22"/>
+          <w:szCs w:val="22"/>
+        </w:rPr>
+        <w:t xml:space="preserve">.</w:t>
+      </w:r>
+    </w:p>
+    <w:tbl>
+      <w:tblPr>
+        <w:tblW w:type="dxa" w:w="9360"/>
+        <w:tblBorders>
+          <w:top w:val="single" w:color="auto" w:sz="4"/>
+          <w:left w:val="single" w:color="auto" w:sz="4"/>
+          <w:bottom w:val="single" w:color="auto" w:sz="4"/>
+          <w:right w:val="single" w:color="auto" w:sz="4"/>
+          <w:insideH w:val="single" w:color="auto" w:sz="4"/>
+          <w:insideV w:val="single" w:color="auto" w:sz="4"/>
+        </w:tblBorders>
+      </w:tblPr>
+      <w:tblGrid>
+        <w:gridCol w:w="3931"/>
+        <w:gridCol w:w="5429"/>
+      </w:tblGrid>
+      <w:tr>
+        <w:trPr>
+          <w:tblHeader/>
+        </w:trPr>
+        <w:tc>
+          <w:tcPr>
+            <w:tcW w:type="dxa" w:w="3931"/>
+            <w:tcBorders>
+              <w:top w:val="single" w:color="CBD5E1" w:sz="4"/>
+              <w:left w:val="single" w:color="CBD5E1" w:sz="4"/>
+              <w:bottom w:val="single" w:color="CBD5E1" w:sz="4"/>
+              <w:right w:val="single" w:color="CBD5E1" w:sz="4"/>
+            </w:tcBorders>
+            <w:shd w:fill="F8FAFC" w:val="clear"/>
+            <w:tcMar>
+              <w:top w:type="dxa" w:w="80"/>
+              <w:left w:type="dxa" w:w="140"/>
+              <w:bottom w:type="dxa" w:w="80"/>
+              <w:right w:type="dxa" w:w="140"/>
+            </w:tcMar>
+          </w:tcPr>
+          <w:p>
+            <w:r>
+              <w:rPr>
+                <w:rFonts w:ascii="Menlo" w:cs="Menlo" w:eastAsia="Menlo" w:hAnsi="Menlo"/>
+                <w:b/>
+                <w:bCs/>
+                <w:color w:val="0F172A"/>
+                <w:sz w:val="18"/>
+                <w:szCs w:val="18"/>
+              </w:rPr>
+              <w:t xml:space="preserve">Layer</w:t>
+            </w:r>
+          </w:p>
+        </w:tc>
+        <w:tc>
+          <w:tcPr>
+            <w:tcW w:type="dxa" w:w="5429"/>
+            <w:tcBorders>
+              <w:top w:val="single" w:color="CBD5E1" w:sz="4"/>
+              <w:left w:val="single" w:color="CBD5E1" w:sz="4"/>
+              <w:bottom w:val="single" w:color="CBD5E1" w:sz="4"/>
+              <w:right w:val="single" w:color="CBD5E1" w:sz="4"/>
+            </w:tcBorders>
+            <w:shd w:fill="F8FAFC" w:val="clear"/>
+            <w:tcMar>
+              <w:top w:type="dxa" w:w="80"/>
+              <w:left w:type="dxa" w:w="140"/>
+              <w:bottom w:type="dxa" w:w="80"/>
+              <w:right w:type="dxa" w:w="140"/>
+            </w:tcMar>
+          </w:tcPr>
+          <w:p>
+            <w:r>
+              <w:rPr>
+                <w:rFonts w:ascii="Menlo" w:cs="Menlo" w:eastAsia="Menlo" w:hAnsi="Menlo"/>
+                <w:b/>
+                <w:bCs/>
+                <w:color w:val="0F172A"/>
+                <w:sz w:val="18"/>
+                <w:szCs w:val="18"/>
+              </w:rPr>
+              <w:t xml:space="preserve">What landed</w:t>
+            </w:r>
+          </w:p>
+        </w:tc>
+      </w:tr>
+      <w:tr>
+        <w:tc>
+          <w:tcPr>
+            <w:tcW w:type="dxa" w:w="3931"/>
+            <w:tcBorders>
+              <w:top w:val="single" w:color="CBD5E1" w:sz="4"/>
+              <w:left w:val="single" w:color="CBD5E1" w:sz="4"/>
+              <w:bottom w:val="single" w:color="CBD5E1" w:sz="4"/>
+              <w:right w:val="single" w:color="CBD5E1" w:sz="4"/>
+            </w:tcBorders>
+            <w:tcMar>
+              <w:top w:type="dxa" w:w="80"/>
+              <w:left w:type="dxa" w:w="140"/>
+              <w:bottom w:type="dxa" w:w="80"/>
+              <w:right w:type="dxa" w:w="140"/>
+            </w:tcMar>
+          </w:tcPr>
+          <w:p>
+            <w:r>
+              <w:rPr>
+                <w:rFonts w:ascii="Georgia" w:cs="Georgia" w:eastAsia="Georgia" w:hAnsi="Georgia"/>
+                <w:b/>
+                <w:bCs/>
+                <w:color w:val="0F172A"/>
+                <w:sz w:val="20"/>
+                <w:szCs w:val="20"/>
+              </w:rPr>
+              <w:t xml:space="preserve">Prompt synthesis</w:t>
+            </w:r>
+          </w:p>
+        </w:tc>
+        <w:tc>
+          <w:tcPr>
+            <w:tcW w:type="dxa" w:w="5429"/>
+            <w:tcBorders>
+              <w:top w:val="single" w:color="CBD5E1" w:sz="4"/>
+              <w:left w:val="single" w:color="CBD5E1" w:sz="4"/>
+              <w:bottom w:val="single" w:color="CBD5E1" w:sz="4"/>
+              <w:right w:val="single" w:color="CBD5E1" w:sz="4"/>
+            </w:tcBorders>
+            <w:tcMar>
+              <w:top w:type="dxa" w:w="80"/>
+              <w:left w:type="dxa" w:w="140"/>
+              <w:bottom w:type="dxa" w:w="80"/>
+              <w:right w:type="dxa" w:w="140"/>
+            </w:tcMar>
+          </w:tcPr>
+          <w:p>
+            <w:r>
+              <w:rPr>
+                <w:rFonts w:ascii="Menlo" w:cs="Menlo" w:eastAsia="Menlo" w:hAnsi="Menlo"/>
+                <w:color w:val="B45309"/>
+                <w:sz w:val="20"/>
+                <w:szCs w:val="20"/>
+              </w:rPr>
+              <w:t xml:space="preserve">aiHeroPrompt({title, excerpt, category})</w:t>
+            </w:r>
+            <w:r>
+              <w:rPr>
+                <w:rFonts w:ascii="Georgia" w:cs="Georgia" w:eastAsia="Georgia" w:hAnsi="Georgia"/>
+                <w:color w:val="0F172A"/>
+                <w:sz w:val="20"/>
+                <w:szCs w:val="20"/>
+              </w:rPr>
+              <w:t xml:space="preserve"> in </w:t>
+            </w:r>
+            <w:r>
+              <w:rPr>
+                <w:rFonts w:ascii="Menlo" w:cs="Menlo" w:eastAsia="Menlo" w:hAnsi="Menlo"/>
+                <w:color w:val="B45309"/>
+                <w:sz w:val="20"/>
+                <w:szCs w:val="20"/>
+              </w:rPr>
+              <w:t xml:space="preserve">src/lib/studio/ai.ts</w:t>
+            </w:r>
+            <w:r>
+              <w:rPr>
+                <w:rFonts w:ascii="Georgia" w:cs="Georgia" w:eastAsia="Georgia" w:hAnsi="Georgia"/>
+                <w:color w:val="0F172A"/>
+                <w:sz w:val="20"/>
+                <w:szCs w:val="20"/>
+              </w:rPr>
+              <w:t xml:space="preserve">. Distinct system prompt from the writing voice — art-director scope, studio palette only (cream / indigo / copper), editorial-illustration register, 16:9 hero framing, NO photoreal / NO text-in-image / NO SaaS gradients. Returns a 60–100 word natural-language prompt.</w:t>
+            </w:r>
+          </w:p>
+        </w:tc>
+      </w:tr>
+      <w:tr>
+        <w:tc>
+          <w:tcPr>
+            <w:tcW w:type="dxa" w:w="3931"/>
+            <w:tcBorders>
+              <w:top w:val="single" w:color="CBD5E1" w:sz="4"/>
+              <w:left w:val="single" w:color="CBD5E1" w:sz="4"/>
+              <w:bottom w:val="single" w:color="CBD5E1" w:sz="4"/>
+              <w:right w:val="single" w:color="CBD5E1" w:sz="4"/>
+            </w:tcBorders>
+            <w:tcMar>
+              <w:top w:type="dxa" w:w="80"/>
+              <w:left w:type="dxa" w:w="140"/>
+              <w:bottom w:type="dxa" w:w="80"/>
+              <w:right w:type="dxa" w:w="140"/>
+            </w:tcMar>
+          </w:tcPr>
+          <w:p>
+            <w:r>
+              <w:rPr>
+                <w:rFonts w:ascii="Georgia" w:cs="Georgia" w:eastAsia="Georgia" w:hAnsi="Georgia"/>
+                <w:b/>
+                <w:bCs/>
+                <w:color w:val="0F172A"/>
+                <w:sz w:val="20"/>
+                <w:szCs w:val="20"/>
+              </w:rPr>
+              <w:t xml:space="preserve">Image-gen adapter</w:t>
+            </w:r>
+          </w:p>
+        </w:tc>
+        <w:tc>
+          <w:tcPr>
+            <w:tcW w:type="dxa" w:w="5429"/>
+            <w:tcBorders>
+              <w:top w:val="single" w:color="CBD5E1" w:sz="4"/>
+              <w:left w:val="single" w:color="CBD5E1" w:sz="4"/>
+              <w:bottom w:val="single" w:color="CBD5E1" w:sz="4"/>
+              <w:right w:val="single" w:color="CBD5E1" w:sz="4"/>
+            </w:tcBorders>
+            <w:tcMar>
+              <w:top w:type="dxa" w:w="80"/>
+              <w:left w:type="dxa" w:w="140"/>
+              <w:bottom w:type="dxa" w:w="80"/>
+              <w:right w:type="dxa" w:w="140"/>
+            </w:tcMar>
+          </w:tcPr>
+          <w:p>
+            <w:r>
+              <w:rPr>
+                <w:rFonts w:ascii="Menlo" w:cs="Menlo" w:eastAsia="Menlo" w:hAnsi="Menlo"/>
+                <w:color w:val="B45309"/>
+                <w:sz w:val="20"/>
+                <w:szCs w:val="20"/>
+              </w:rPr>
+              <w:t xml:space="preserve">src/lib/studio/image-gen.ts</w:t>
+            </w:r>
+            <w:r>
+              <w:rPr>
+                <w:rFonts w:ascii="Georgia" w:cs="Georgia" w:eastAsia="Georgia" w:hAnsi="Georgia"/>
+                <w:color w:val="0F172A"/>
+                <w:sz w:val="20"/>
+                <w:szCs w:val="20"/>
+              </w:rPr>
+              <w:t xml:space="preserve">. Provider-agnostic surface; Replicate (FLUX.1 schnell) is the default backend. Uses </w:t>
+            </w:r>
+            <w:r>
+              <w:rPr>
+                <w:rFonts w:ascii="Menlo" w:cs="Menlo" w:eastAsia="Menlo" w:hAnsi="Menlo"/>
+                <w:color w:val="B45309"/>
+                <w:sz w:val="20"/>
+                <w:szCs w:val="20"/>
+              </w:rPr>
+              <w:t xml:space="preserve">Prefer: wait=30</w:t>
+            </w:r>
+            <w:r>
+              <w:rPr>
+                <w:rFonts w:ascii="Georgia" w:cs="Georgia" w:eastAsia="Georgia" w:hAnsi="Georgia"/>
+                <w:color w:val="0F172A"/>
+                <w:sz w:val="20"/>
+                <w:szCs w:val="20"/>
+              </w:rPr>
+              <w:t xml:space="preserve"> for single-round-trip happy path; polls </w:t>
+            </w:r>
+            <w:r>
+              <w:rPr>
+                <w:rFonts w:ascii="Menlo" w:cs="Menlo" w:eastAsia="Menlo" w:hAnsi="Menlo"/>
+                <w:color w:val="B45309"/>
+                <w:sz w:val="20"/>
+                <w:szCs w:val="20"/>
+              </w:rPr>
+              <w:t xml:space="preserve">urls.get</w:t>
+            </w:r>
+            <w:r>
+              <w:rPr>
+                <w:rFonts w:ascii="Georgia" w:cs="Georgia" w:eastAsia="Georgia" w:hAnsi="Georgia"/>
+                <w:color w:val="0F172A"/>
+                <w:sz w:val="20"/>
+                <w:szCs w:val="20"/>
+              </w:rPr>
+              <w:t xml:space="preserve"> every 1 s up to 45 s on slower runs. ~$0.003 per FLUX schnell image.</w:t>
+            </w:r>
+          </w:p>
+        </w:tc>
+      </w:tr>
+      <w:tr>
+        <w:tc>
+          <w:tcPr>
+            <w:tcW w:type="dxa" w:w="3931"/>
+            <w:tcBorders>
+              <w:top w:val="single" w:color="CBD5E1" w:sz="4"/>
+              <w:left w:val="single" w:color="CBD5E1" w:sz="4"/>
+              <w:bottom w:val="single" w:color="CBD5E1" w:sz="4"/>
+              <w:right w:val="single" w:color="CBD5E1" w:sz="4"/>
+            </w:tcBorders>
+            <w:tcMar>
+              <w:top w:type="dxa" w:w="80"/>
+              <w:left w:type="dxa" w:w="140"/>
+              <w:bottom w:type="dxa" w:w="80"/>
+              <w:right w:type="dxa" w:w="140"/>
+            </w:tcMar>
+          </w:tcPr>
+          <w:p>
+            <w:r>
+              <w:rPr>
+                <w:rFonts w:ascii="Georgia" w:cs="Georgia" w:eastAsia="Georgia" w:hAnsi="Georgia"/>
+                <w:b/>
+                <w:bCs/>
+                <w:color w:val="0F172A"/>
+                <w:sz w:val="20"/>
+                <w:szCs w:val="20"/>
+              </w:rPr>
+              <w:t xml:space="preserve">Chained route</w:t>
+            </w:r>
+          </w:p>
+        </w:tc>
+        <w:tc>
+          <w:tcPr>
+            <w:tcW w:type="dxa" w:w="5429"/>
+            <w:tcBorders>
+              <w:top w:val="single" w:color="CBD5E1" w:sz="4"/>
+              <w:left w:val="single" w:color="CBD5E1" w:sz="4"/>
+              <w:bottom w:val="single" w:color="CBD5E1" w:sz="4"/>
+              <w:right w:val="single" w:color="CBD5E1" w:sz="4"/>
+            </w:tcBorders>
+            <w:tcMar>
+              <w:top w:type="dxa" w:w="80"/>
+              <w:left w:type="dxa" w:w="140"/>
+              <w:bottom w:type="dxa" w:w="80"/>
+              <w:right w:type="dxa" w:w="140"/>
+            </w:tcMar>
+          </w:tcPr>
+          <w:p>
+            <w:r>
+              <w:rPr>
+                <w:rFonts w:ascii="Menlo" w:cs="Menlo" w:eastAsia="Menlo" w:hAnsi="Menlo"/>
+                <w:color w:val="B45309"/>
+                <w:sz w:val="20"/>
+                <w:szCs w:val="20"/>
+              </w:rPr>
+              <w:t xml:space="preserve">POST /api/studio/ai/hero</w:t>
+            </w:r>
+            <w:r>
+              <w:rPr>
+                <w:rFonts w:ascii="Georgia" w:cs="Georgia" w:eastAsia="Georgia" w:hAnsi="Georgia"/>
+                <w:color w:val="0F172A"/>
+                <w:sz w:val="20"/>
+                <w:szCs w:val="20"/>
+              </w:rPr>
+              <w:t xml:space="preserve"> — body </w:t>
+            </w:r>
+            <w:r>
+              <w:rPr>
+                <w:rFonts w:ascii="Menlo" w:cs="Menlo" w:eastAsia="Menlo" w:hAnsi="Menlo"/>
+                <w:color w:val="B45309"/>
+                <w:sz w:val="20"/>
+                <w:szCs w:val="20"/>
+              </w:rPr>
+              <w:t xml:space="preserve">{title, excerpt?, category?, customPrompt?}</w:t>
+            </w:r>
+            <w:r>
+              <w:rPr>
+                <w:rFonts w:ascii="Georgia" w:cs="Georgia" w:eastAsia="Georgia" w:hAnsi="Georgia"/>
+                <w:color w:val="0F172A"/>
+                <w:sz w:val="20"/>
+                <w:szCs w:val="20"/>
+              </w:rPr>
+              <w:t xml:space="preserve">. Synthesises a prompt (skipped if </w:t>
+            </w:r>
+            <w:r>
+              <w:rPr>
+                <w:rFonts w:ascii="Menlo" w:cs="Menlo" w:eastAsia="Menlo" w:hAnsi="Menlo"/>
+                <w:color w:val="B45309"/>
+                <w:sz w:val="20"/>
+                <w:szCs w:val="20"/>
+              </w:rPr>
+              <w:t xml:space="preserve">customPrompt</w:t>
+            </w:r>
+            <w:r>
+              <w:rPr>
+                <w:rFonts w:ascii="Georgia" w:cs="Georgia" w:eastAsia="Georgia" w:hAnsi="Georgia"/>
+                <w:color w:val="0F172A"/>
+                <w:sz w:val="20"/>
+                <w:szCs w:val="20"/>
+              </w:rPr>
+              <w:t xml:space="preserve"> provided), generates the image, content-addresses by sha256, uploads to the </w:t>
+            </w:r>
+            <w:r>
+              <w:rPr>
+                <w:rFonts w:ascii="Menlo" w:cs="Menlo" w:eastAsia="Menlo" w:hAnsi="Menlo"/>
+                <w:color w:val="B45309"/>
+                <w:sz w:val="20"/>
+                <w:szCs w:val="20"/>
+              </w:rPr>
+              <w:t xml:space="preserve">studio-uploads</w:t>
+            </w:r>
+            <w:r>
+              <w:rPr>
+                <w:rFonts w:ascii="Georgia" w:cs="Georgia" w:eastAsia="Georgia" w:hAnsi="Georgia"/>
+                <w:color w:val="0F172A"/>
+                <w:sz w:val="20"/>
+                <w:szCs w:val="20"/>
+              </w:rPr>
+              <w:t xml:space="preserve"> bucket under a </w:t>
+            </w:r>
+            <w:r>
+              <w:rPr>
+                <w:rFonts w:ascii="Menlo" w:cs="Menlo" w:eastAsia="Menlo" w:hAnsi="Menlo"/>
+                <w:color w:val="B45309"/>
+                <w:sz w:val="20"/>
+                <w:szCs w:val="20"/>
+              </w:rPr>
+              <w:t xml:space="preserve">hero/</w:t>
+            </w:r>
+            <w:r>
+              <w:rPr>
+                <w:rFonts w:ascii="Georgia" w:cs="Georgia" w:eastAsia="Georgia" w:hAnsi="Georgia"/>
+                <w:color w:val="0F172A"/>
+                <w:sz w:val="20"/>
+                <w:szCs w:val="20"/>
+              </w:rPr>
+              <w:t xml:space="preserve"> prefix, returns the public CDN URL. </w:t>
+            </w:r>
+            <w:r>
+              <w:rPr>
+                <w:rFonts w:ascii="Menlo" w:cs="Menlo" w:eastAsia="Menlo" w:hAnsi="Menlo"/>
+                <w:color w:val="B45309"/>
+                <w:sz w:val="20"/>
+                <w:szCs w:val="20"/>
+              </w:rPr>
+              <w:t xml:space="preserve">maxDuration=60</w:t>
+            </w:r>
+            <w:r>
+              <w:rPr>
+                <w:rFonts w:ascii="Georgia" w:cs="Georgia" w:eastAsia="Georgia" w:hAnsi="Georgia"/>
+                <w:color w:val="0F172A"/>
+                <w:sz w:val="20"/>
+                <w:szCs w:val="20"/>
+              </w:rPr>
+              <w:t xml:space="preserve">.</w:t>
+            </w:r>
+          </w:p>
+        </w:tc>
+      </w:tr>
+      <w:tr>
+        <w:tc>
+          <w:tcPr>
+            <w:tcW w:type="dxa" w:w="3931"/>
+            <w:tcBorders>
+              <w:top w:val="single" w:color="CBD5E1" w:sz="4"/>
+              <w:left w:val="single" w:color="CBD5E1" w:sz="4"/>
+              <w:bottom w:val="single" w:color="CBD5E1" w:sz="4"/>
+              <w:right w:val="single" w:color="CBD5E1" w:sz="4"/>
+            </w:tcBorders>
+            <w:tcMar>
+              <w:top w:type="dxa" w:w="80"/>
+              <w:left w:type="dxa" w:w="140"/>
+              <w:bottom w:type="dxa" w:w="80"/>
+              <w:right w:type="dxa" w:w="140"/>
+            </w:tcMar>
+          </w:tcPr>
+          <w:p>
+            <w:r>
+              <w:rPr>
+                <w:rFonts w:ascii="Georgia" w:cs="Georgia" w:eastAsia="Georgia" w:hAnsi="Georgia"/>
+                <w:b/>
+                <w:bCs/>
+                <w:color w:val="0F172A"/>
+                <w:sz w:val="20"/>
+                <w:szCs w:val="20"/>
+              </w:rPr>
+              <w:t xml:space="preserve">UI</w:t>
+            </w:r>
+          </w:p>
+        </w:tc>
+        <w:tc>
+          <w:tcPr>
+            <w:tcW w:type="dxa" w:w="5429"/>
+            <w:tcBorders>
+              <w:top w:val="single" w:color="CBD5E1" w:sz="4"/>
+              <w:left w:val="single" w:color="CBD5E1" w:sz="4"/>
+              <w:bottom w:val="single" w:color="CBD5E1" w:sz="4"/>
+              <w:right w:val="single" w:color="CBD5E1" w:sz="4"/>
+            </w:tcBorders>
+            <w:tcMar>
+              <w:top w:type="dxa" w:w="80"/>
+              <w:left w:type="dxa" w:w="140"/>
+              <w:bottom w:type="dxa" w:w="80"/>
+              <w:right w:type="dxa" w:w="140"/>
+            </w:tcMar>
+          </w:tcPr>
+          <w:p>
+            <w:r>
+              <w:rPr>
+                <w:rFonts w:ascii="Menlo" w:cs="Menlo" w:eastAsia="Menlo" w:hAnsi="Menlo"/>
+                <w:color w:val="B45309"/>
+                <w:sz w:val="20"/>
+                <w:szCs w:val="20"/>
+              </w:rPr>
+              <w:t xml:space="preserve">HeroGeneratorBlock</w:t>
+            </w:r>
+            <w:r>
+              <w:rPr>
+                <w:rFonts w:ascii="Georgia" w:cs="Georgia" w:eastAsia="Georgia" w:hAnsi="Georgia"/>
+                <w:color w:val="0F172A"/>
+                <w:sz w:val="20"/>
+                <w:szCs w:val="20"/>
+              </w:rPr>
+              <w:t xml:space="preserve"> inside the editor's "More frontmatter" details. "✨ Generate hero" button (disabled until a title exists) → status badge → 16:9 preview card with the rendered image, the prompt that produced it, and metadata (provider · model · duration · bytes). Four follow-up actions: </w:t>
+            </w:r>
+            <w:r>
+              <w:rPr>
+                <w:rFonts w:ascii="Georgia" w:cs="Georgia" w:eastAsia="Georgia" w:hAnsi="Georgia"/>
+                <w:b/>
+                <w:bCs/>
+                <w:color w:val="0F172A"/>
+                <w:sz w:val="20"/>
+                <w:szCs w:val="20"/>
+              </w:rPr>
+              <w:t xml:space="preserve">Use it</w:t>
+            </w:r>
+            <w:r>
+              <w:rPr>
+                <w:rFonts w:ascii="Georgia" w:cs="Georgia" w:eastAsia="Georgia" w:hAnsi="Georgia"/>
+                <w:color w:val="0F172A"/>
+                <w:sz w:val="20"/>
+                <w:szCs w:val="20"/>
+              </w:rPr>
+              <w:t xml:space="preserve"> (sets </w:t>
+            </w:r>
+            <w:r>
+              <w:rPr>
+                <w:rFonts w:ascii="Menlo" w:cs="Menlo" w:eastAsia="Menlo" w:hAnsi="Menlo"/>
+                <w:color w:val="B45309"/>
+                <w:sz w:val="20"/>
+                <w:szCs w:val="20"/>
+              </w:rPr>
+              <w:t xml:space="preserve">frontmatter.hero</w:t>
+            </w:r>
+            <w:r>
+              <w:rPr>
+                <w:rFonts w:ascii="Georgia" w:cs="Georgia" w:eastAsia="Georgia" w:hAnsi="Georgia"/>
+                <w:color w:val="0F172A"/>
+                <w:sz w:val="20"/>
+                <w:szCs w:val="20"/>
+              </w:rPr>
+              <w:t xml:space="preserve"> + autosaves), </w:t>
+            </w:r>
+            <w:r>
+              <w:rPr>
+                <w:rFonts w:ascii="Georgia" w:cs="Georgia" w:eastAsia="Georgia" w:hAnsi="Georgia"/>
+                <w:b/>
+                <w:bCs/>
+                <w:color w:val="0F172A"/>
+                <w:sz w:val="20"/>
+                <w:szCs w:val="20"/>
+              </w:rPr>
+              <w:t xml:space="preserve">Regenerate</w:t>
+            </w:r>
+            <w:r>
+              <w:rPr>
+                <w:rFonts w:ascii="Georgia" w:cs="Georgia" w:eastAsia="Georgia" w:hAnsi="Georgia"/>
+                <w:color w:val="0F172A"/>
+                <w:sz w:val="20"/>
+                <w:szCs w:val="20"/>
+              </w:rPr>
+              <w:t xml:space="preserve">, </w:t>
+            </w:r>
+            <w:r>
+              <w:rPr>
+                <w:rFonts w:ascii="Georgia" w:cs="Georgia" w:eastAsia="Georgia" w:hAnsi="Georgia"/>
+                <w:b/>
+                <w:bCs/>
+                <w:color w:val="0F172A"/>
+                <w:sz w:val="20"/>
+                <w:szCs w:val="20"/>
+              </w:rPr>
+              <w:t xml:space="preserve">Edit prompt</w:t>
+            </w:r>
+            <w:r>
+              <w:rPr>
+                <w:rFonts w:ascii="Georgia" w:cs="Georgia" w:eastAsia="Georgia" w:hAnsi="Georgia"/>
+                <w:color w:val="0F172A"/>
+                <w:sz w:val="20"/>
+                <w:szCs w:val="20"/>
+              </w:rPr>
+              <w:t xml:space="preserve"> (textarea pre-filled with the current prompt; "Regenerate with this prompt" feeds the route's </w:t>
+            </w:r>
+            <w:r>
+              <w:rPr>
+                <w:rFonts w:ascii="Menlo" w:cs="Menlo" w:eastAsia="Menlo" w:hAnsi="Menlo"/>
+                <w:color w:val="B45309"/>
+                <w:sz w:val="20"/>
+                <w:szCs w:val="20"/>
+              </w:rPr>
+              <w:t xml:space="preserve">customPrompt</w:t>
+            </w:r>
+            <w:r>
+              <w:rPr>
+                <w:rFonts w:ascii="Georgia" w:cs="Georgia" w:eastAsia="Georgia" w:hAnsi="Georgia"/>
+                <w:color w:val="0F172A"/>
+                <w:sz w:val="20"/>
+                <w:szCs w:val="20"/>
+              </w:rPr>
+              <w:t xml:space="preserve">), </w:t>
+            </w:r>
+            <w:r>
+              <w:rPr>
+                <w:rFonts w:ascii="Georgia" w:cs="Georgia" w:eastAsia="Georgia" w:hAnsi="Georgia"/>
+                <w:b/>
+                <w:bCs/>
+                <w:color w:val="0F172A"/>
+                <w:sz w:val="20"/>
+                <w:szCs w:val="20"/>
+              </w:rPr>
+              <w:t xml:space="preserve">Dismiss</w:t>
+            </w:r>
+            <w:r>
+              <w:rPr>
+                <w:rFonts w:ascii="Georgia" w:cs="Georgia" w:eastAsia="Georgia" w:hAnsi="Georgia"/>
+                <w:color w:val="0F172A"/>
+                <w:sz w:val="20"/>
+                <w:szCs w:val="20"/>
+              </w:rPr>
+              <w:t xml:space="preserve">.</w:t>
+            </w:r>
+          </w:p>
+        </w:tc>
+      </w:tr>
+    </w:tbl>
+    <w:p>
+      <w:pPr>
+        <w:spacing w:after="140" w:line="320"/>
+      </w:pPr>
+      <w:r>
+        <w:rPr>
+          <w:rFonts w:ascii="Georgia" w:cs="Georgia" w:eastAsia="Georgia" w:hAnsi="Georgia"/>
+          <w:b/>
+          <w:bCs/>
+          <w:color w:val="0F172A"/>
+          <w:sz w:val="22"/>
+          <w:szCs w:val="22"/>
+        </w:rPr>
+        <w:t xml:space="preserve">Live state (2026-05-14, code-complete):</w:t>
+      </w:r>
+    </w:p>
+    <w:p>
+      <w:pPr>
+        <w:pStyle w:val="ListParagraph"/>
+        <w:numPr>
+          <w:ilvl w:val="0"/>
+          <w:numId w:val="2"/>
+        </w:numPr>
+        <w:spacing w:after="80" w:line="300"/>
+      </w:pPr>
+      <w:r>
+        <w:rPr>
+          <w:rFonts w:ascii="Georgia" w:cs="Georgia" w:eastAsia="Georgia" w:hAnsi="Georgia"/>
+          <w:b/>
+          <w:bCs/>
+          <w:color w:val="0F172A"/>
+          <w:sz w:val="22"/>
+          <w:szCs w:val="22"/>
+        </w:rPr>
+        <w:t xml:space="preserve">Required Tarry-side:</w:t>
+      </w:r>
+      <w:r>
+        <w:rPr>
+          <w:rFonts w:ascii="Georgia" w:cs="Georgia" w:eastAsia="Georgia" w:hAnsi="Georgia"/>
+          <w:color w:val="0F172A"/>
+          <w:sz w:val="22"/>
+          <w:szCs w:val="22"/>
+        </w:rPr>
+        <w:t xml:space="preserve"> </w:t>
+      </w:r>
+      <w:r>
+        <w:rPr>
+          <w:rFonts w:ascii="Menlo" w:cs="Menlo" w:eastAsia="Menlo" w:hAnsi="Menlo"/>
+          <w:color w:val="B45309"/>
+          <w:sz w:val="20"/>
+          <w:szCs w:val="20"/>
+        </w:rPr>
+        <w:t xml:space="preserve">REPLICATE_API_TOKEN</w:t>
+      </w:r>
+      <w:r>
+        <w:rPr>
+          <w:rFonts w:ascii="Georgia" w:cs="Georgia" w:eastAsia="Georgia" w:hAnsi="Georgia"/>
+          <w:color w:val="0F172A"/>
+          <w:sz w:val="22"/>
+          <w:szCs w:val="22"/>
+        </w:rPr>
+        <w:t xml:space="preserve"> on </w:t>
+      </w:r>
+      <w:r>
+        <w:rPr>
+          <w:rFonts w:ascii="Menlo" w:cs="Menlo" w:eastAsia="Menlo" w:hAnsi="Menlo"/>
+          <w:color w:val="B45309"/>
+          <w:sz w:val="20"/>
+          <w:szCs w:val="20"/>
+        </w:rPr>
+        <w:t xml:space="preserve">tarrysingh-com-zdmb</w:t>
+      </w:r>
+      <w:r>
+        <w:rPr>
+          <w:rFonts w:ascii="Georgia" w:cs="Georgia" w:eastAsia="Georgia" w:hAnsi="Georgia"/>
+          <w:color w:val="0F172A"/>
+          <w:sz w:val="22"/>
+          <w:szCs w:val="22"/>
+        </w:rPr>
+        <w:t xml:space="preserve"> Vercel (Dev / Preview / Prod). Mint at https://replicate.com/account/api-tokens. Editor surfaces </w:t>
+      </w:r>
+      <w:r>
+        <w:rPr>
+          <w:rFonts w:ascii="Menlo" w:cs="Menlo" w:eastAsia="Menlo" w:hAnsi="Menlo"/>
+          <w:color w:val="B45309"/>
+          <w:sz w:val="20"/>
+          <w:szCs w:val="20"/>
+        </w:rPr>
+        <w:t xml:space="preserve">image_gen_unconfigured</w:t>
+      </w:r>
+      <w:r>
+        <w:rPr>
+          <w:rFonts w:ascii="Georgia" w:cs="Georgia" w:eastAsia="Georgia" w:hAnsi="Georgia"/>
+          <w:color w:val="0F172A"/>
+          <w:sz w:val="22"/>
+          <w:szCs w:val="22"/>
+        </w:rPr>
+        <w:t xml:space="preserve"> until set.</w:t>
+      </w:r>
+    </w:p>
+    <w:p>
+      <w:pPr>
+        <w:pStyle w:val="ListParagraph"/>
+        <w:numPr>
+          <w:ilvl w:val="0"/>
+          <w:numId w:val="2"/>
+        </w:numPr>
+        <w:spacing w:after="80" w:line="300"/>
+      </w:pPr>
+      <w:r>
+        <w:rPr>
+          <w:rFonts w:ascii="Georgia" w:cs="Georgia" w:eastAsia="Georgia" w:hAnsi="Georgia"/>
+          <w:b/>
+          <w:bCs/>
+          <w:color w:val="0F172A"/>
+          <w:sz w:val="22"/>
+          <w:szCs w:val="22"/>
+        </w:rPr>
+        <w:t xml:space="preserve">Optional env:</w:t>
+      </w:r>
+      <w:r>
+        <w:rPr>
+          <w:rFonts w:ascii="Georgia" w:cs="Georgia" w:eastAsia="Georgia" w:hAnsi="Georgia"/>
+          <w:color w:val="0F172A"/>
+          <w:sz w:val="22"/>
+          <w:szCs w:val="22"/>
+        </w:rPr>
+        <w:t xml:space="preserve"> </w:t>
+      </w:r>
+      <w:r>
+        <w:rPr>
+          <w:rFonts w:ascii="Menlo" w:cs="Menlo" w:eastAsia="Menlo" w:hAnsi="Menlo"/>
+          <w:color w:val="B45309"/>
+          <w:sz w:val="20"/>
+          <w:szCs w:val="20"/>
+        </w:rPr>
+        <w:t xml:space="preserve">STUDIO_IMAGE_GEN_PROVIDER</w:t>
+      </w:r>
+      <w:r>
+        <w:rPr>
+          <w:rFonts w:ascii="Georgia" w:cs="Georgia" w:eastAsia="Georgia" w:hAnsi="Georgia"/>
+          <w:color w:val="0F172A"/>
+          <w:sz w:val="22"/>
+          <w:szCs w:val="22"/>
+        </w:rPr>
+        <w:t xml:space="preserve">, </w:t>
+      </w:r>
+      <w:r>
+        <w:rPr>
+          <w:rFonts w:ascii="Menlo" w:cs="Menlo" w:eastAsia="Menlo" w:hAnsi="Menlo"/>
+          <w:color w:val="B45309"/>
+          <w:sz w:val="20"/>
+          <w:szCs w:val="20"/>
+        </w:rPr>
+        <w:t xml:space="preserve">STUDIO_IMAGE_GEN_MODEL</w:t>
+      </w:r>
+      <w:r>
+        <w:rPr>
+          <w:rFonts w:ascii="Georgia" w:cs="Georgia" w:eastAsia="Georgia" w:hAnsi="Georgia"/>
+          <w:color w:val="0F172A"/>
+          <w:sz w:val="22"/>
+          <w:szCs w:val="22"/>
+        </w:rPr>
+        <w:t xml:space="preserve">, </w:t>
+      </w:r>
+      <w:r>
+        <w:rPr>
+          <w:rFonts w:ascii="Menlo" w:cs="Menlo" w:eastAsia="Menlo" w:hAnsi="Menlo"/>
+          <w:color w:val="B45309"/>
+          <w:sz w:val="20"/>
+          <w:szCs w:val="20"/>
+        </w:rPr>
+        <w:t xml:space="preserve">STUDIO_IMAGE_GEN_ASPECT</w:t>
+      </w:r>
+      <w:r>
+        <w:rPr>
+          <w:rFonts w:ascii="Georgia" w:cs="Georgia" w:eastAsia="Georgia" w:hAnsi="Georgia"/>
+          <w:color w:val="0F172A"/>
+          <w:sz w:val="22"/>
+          <w:szCs w:val="22"/>
+        </w:rPr>
+        <w:t xml:space="preserve">, </w:t>
+      </w:r>
+      <w:r>
+        <w:rPr>
+          <w:rFonts w:ascii="Menlo" w:cs="Menlo" w:eastAsia="Menlo" w:hAnsi="Menlo"/>
+          <w:color w:val="B45309"/>
+          <w:sz w:val="20"/>
+          <w:szCs w:val="20"/>
+        </w:rPr>
+        <w:t xml:space="preserve">STUDIO_IMAGE_GEN_FORMAT</w:t>
+      </w:r>
+      <w:r>
+        <w:rPr>
+          <w:rFonts w:ascii="Georgia" w:cs="Georgia" w:eastAsia="Georgia" w:hAnsi="Georgia"/>
+          <w:color w:val="0F172A"/>
+          <w:sz w:val="22"/>
+          <w:szCs w:val="22"/>
+        </w:rPr>
+        <w:t xml:space="preserve"> — defaults match the migration + adapter.</w:t>
+      </w:r>
+    </w:p>
+    <w:p>
+      <w:pPr>
+        <w:pStyle w:val="ListParagraph"/>
+        <w:numPr>
+          <w:ilvl w:val="0"/>
+          <w:numId w:val="2"/>
+        </w:numPr>
+        <w:spacing w:after="80" w:line="300"/>
+      </w:pPr>
+      <w:r>
+        <w:rPr>
+          <w:rFonts w:ascii="Georgia" w:cs="Georgia" w:eastAsia="Georgia" w:hAnsi="Georgia"/>
+          <w:b/>
+          <w:bCs/>
+          <w:color w:val="0F172A"/>
+          <w:sz w:val="22"/>
+          <w:szCs w:val="22"/>
+        </w:rPr>
+        <w:t xml:space="preserve">`next build` passes</w:t>
+      </w:r>
+      <w:r>
+        <w:rPr>
+          <w:rFonts w:ascii="Georgia" w:cs="Georgia" w:eastAsia="Georgia" w:hAnsi="Georgia"/>
+          <w:color w:val="0F172A"/>
+          <w:sz w:val="22"/>
+          <w:szCs w:val="22"/>
+        </w:rPr>
+        <w:t xml:space="preserve"> with </w:t>
+      </w:r>
+      <w:r>
+        <w:rPr>
+          <w:rFonts w:ascii="Menlo" w:cs="Menlo" w:eastAsia="Menlo" w:hAnsi="Menlo"/>
+          <w:color w:val="B45309"/>
+          <w:sz w:val="20"/>
+          <w:szCs w:val="20"/>
+        </w:rPr>
+        <w:t xml:space="preserve">/api/studio/ai/hero</w:t>
+      </w:r>
+      <w:r>
+        <w:rPr>
+          <w:rFonts w:ascii="Georgia" w:cs="Georgia" w:eastAsia="Georgia" w:hAnsi="Georgia"/>
+          <w:color w:val="0F172A"/>
+          <w:sz w:val="22"/>
+          <w:szCs w:val="22"/>
+        </w:rPr>
+        <w:t xml:space="preserve"> in the routes list.</w:t>
+      </w:r>
+    </w:p>
+    <w:p>
+      <w:pPr>
+        <w:pStyle w:val="ListParagraph"/>
+        <w:numPr>
+          <w:ilvl w:val="0"/>
+          <w:numId w:val="2"/>
+        </w:numPr>
+        <w:spacing w:after="80" w:line="300"/>
+      </w:pPr>
+      <w:r>
+        <w:rPr>
+          <w:rFonts w:ascii="Georgia" w:cs="Georgia" w:eastAsia="Georgia" w:hAnsi="Georgia"/>
+          <w:b/>
+          <w:bCs/>
+          <w:color w:val="0F172A"/>
+          <w:sz w:val="22"/>
+          <w:szCs w:val="22"/>
+        </w:rPr>
+        <w:t xml:space="preserve">Reuses Sprint 4.2's bucket</w:t>
+      </w:r>
+      <w:r>
+        <w:rPr>
+          <w:rFonts w:ascii="Georgia" w:cs="Georgia" w:eastAsia="Georgia" w:hAnsi="Georgia"/>
+          <w:color w:val="0F172A"/>
+          <w:sz w:val="22"/>
+          <w:szCs w:val="22"/>
+        </w:rPr>
+        <w:t xml:space="preserve"> under a </w:t>
+      </w:r>
+      <w:r>
+        <w:rPr>
+          <w:rFonts w:ascii="Menlo" w:cs="Menlo" w:eastAsia="Menlo" w:hAnsi="Menlo"/>
+          <w:color w:val="B45309"/>
+          <w:sz w:val="20"/>
+          <w:szCs w:val="20"/>
+        </w:rPr>
+        <w:t xml:space="preserve">hero/</w:t>
+      </w:r>
+      <w:r>
+        <w:rPr>
+          <w:rFonts w:ascii="Georgia" w:cs="Georgia" w:eastAsia="Georgia" w:hAnsi="Georgia"/>
+          <w:color w:val="0F172A"/>
+          <w:sz w:val="22"/>
+          <w:szCs w:val="22"/>
+        </w:rPr>
+        <w:t xml:space="preserve"> filename prefix.</w:t>
+      </w:r>
+    </w:p>
+    <w:p>
+      <w:pPr>
+        <w:pStyle w:val="ListParagraph"/>
+        <w:numPr>
+          <w:ilvl w:val="0"/>
+          <w:numId w:val="2"/>
+        </w:numPr>
+        <w:spacing w:after="80" w:line="300"/>
+      </w:pPr>
+      <w:r>
+        <w:rPr>
+          <w:rFonts w:ascii="Georgia" w:cs="Georgia" w:eastAsia="Georgia" w:hAnsi="Georgia"/>
+          <w:b/>
+          <w:bCs/>
+          <w:color w:val="0F172A"/>
+          <w:sz w:val="22"/>
+          <w:szCs w:val="22"/>
+        </w:rPr>
+        <w:t xml:space="preserve">Pending Tarry-side UAT:</w:t>
+      </w:r>
+      <w:r>
+        <w:rPr>
+          <w:rFonts w:ascii="Georgia" w:cs="Georgia" w:eastAsia="Georgia" w:hAnsi="Georgia"/>
+          <w:color w:val="0F172A"/>
+          <w:sz w:val="22"/>
+          <w:szCs w:val="22"/>
+        </w:rPr>
+        <w:t xml:space="preserve"> set the Replicate token → click "✨ Generate hero" on a real Dispatch → exercise Use / Regenerate / Edit-prompt → confirm the resulting URL renders correctly on the published </w:t>
+      </w:r>
+      <w:r>
+        <w:rPr>
+          <w:rFonts w:ascii="Menlo" w:cs="Menlo" w:eastAsia="Menlo" w:hAnsi="Menlo"/>
+          <w:color w:val="B45309"/>
+          <w:sz w:val="20"/>
+          <w:szCs w:val="20"/>
+        </w:rPr>
+        <w:t xml:space="preserve">/blog/&lt;slug&gt;</w:t>
+      </w:r>
+      <w:r>
+        <w:rPr>
+          <w:rFonts w:ascii="Georgia" w:cs="Georgia" w:eastAsia="Georgia" w:hAnsi="Georgia"/>
+          <w:color w:val="0F172A"/>
+          <w:sz w:val="22"/>
+          <w:szCs w:val="22"/>
+        </w:rPr>
+        <w:t xml:space="preserve"> post.</w:t>
       </w:r>
     </w:p>
     <w:p>
@@ -14892,6 +15936,100 @@
                 <w:sz w:val="20"/>
                 <w:szCs w:val="20"/>
               </w:rPr>
+              <w:t xml:space="preserve">AI-rendered hero pipeline (Sprint 5)</w:t>
+            </w:r>
+          </w:p>
+        </w:tc>
+        <w:tc>
+          <w:tcPr>
+            <w:tcW w:type="dxa" w:w="5429"/>
+            <w:tcBorders>
+              <w:top w:val="single" w:color="CBD5E1" w:sz="4"/>
+              <w:left w:val="single" w:color="CBD5E1" w:sz="4"/>
+              <w:bottom w:val="single" w:color="CBD5E1" w:sz="4"/>
+              <w:right w:val="single" w:color="CBD5E1" w:sz="4"/>
+            </w:tcBorders>
+            <w:tcMar>
+              <w:top w:type="dxa" w:w="80"/>
+              <w:left w:type="dxa" w:w="140"/>
+              <w:bottom w:type="dxa" w:w="80"/>
+              <w:right w:type="dxa" w:w="140"/>
+            </w:tcMar>
+          </w:tcPr>
+          <w:p>
+            <w:r>
+              <w:rPr>
+                <w:rFonts w:ascii="Menlo" w:cs="Menlo" w:eastAsia="Menlo" w:hAnsi="Menlo"/>
+                <w:color w:val="B45309"/>
+                <w:sz w:val="20"/>
+                <w:szCs w:val="20"/>
+              </w:rPr>
+              <w:t xml:space="preserve">src/lib/studio/ai.ts:aiHeroPrompt</w:t>
+            </w:r>
+            <w:r>
+              <w:rPr>
+                <w:rFonts w:ascii="Georgia" w:cs="Georgia" w:eastAsia="Georgia" w:hAnsi="Georgia"/>
+                <w:color w:val="0F172A"/>
+                <w:sz w:val="20"/>
+                <w:szCs w:val="20"/>
+              </w:rPr>
+              <w:t xml:space="preserve">, </w:t>
+            </w:r>
+            <w:r>
+              <w:rPr>
+                <w:rFonts w:ascii="Menlo" w:cs="Menlo" w:eastAsia="Menlo" w:hAnsi="Menlo"/>
+                <w:color w:val="B45309"/>
+                <w:sz w:val="20"/>
+                <w:szCs w:val="20"/>
+              </w:rPr>
+              <w:t xml:space="preserve">src/lib/studio/image-gen.ts</w:t>
+            </w:r>
+            <w:r>
+              <w:rPr>
+                <w:rFonts w:ascii="Georgia" w:cs="Georgia" w:eastAsia="Georgia" w:hAnsi="Georgia"/>
+                <w:color w:val="0F172A"/>
+                <w:sz w:val="20"/>
+                <w:szCs w:val="20"/>
+              </w:rPr>
+              <w:t xml:space="preserve">, </w:t>
+            </w:r>
+            <w:r>
+              <w:rPr>
+                <w:rFonts w:ascii="Menlo" w:cs="Menlo" w:eastAsia="Menlo" w:hAnsi="Menlo"/>
+                <w:color w:val="B45309"/>
+                <w:sz w:val="20"/>
+                <w:szCs w:val="20"/>
+              </w:rPr>
+              <w:t xml:space="preserve">src/app/api/studio/ai/hero/route.ts</w:t>
+            </w:r>
+          </w:p>
+        </w:tc>
+      </w:tr>
+      <w:tr>
+        <w:tc>
+          <w:tcPr>
+            <w:tcW w:type="dxa" w:w="3931"/>
+            <w:tcBorders>
+              <w:top w:val="single" w:color="CBD5E1" w:sz="4"/>
+              <w:left w:val="single" w:color="CBD5E1" w:sz="4"/>
+              <w:bottom w:val="single" w:color="CBD5E1" w:sz="4"/>
+              <w:right w:val="single" w:color="CBD5E1" w:sz="4"/>
+            </w:tcBorders>
+            <w:tcMar>
+              <w:top w:type="dxa" w:w="80"/>
+              <w:left w:type="dxa" w:w="140"/>
+              <w:bottom w:type="dxa" w:w="80"/>
+              <w:right w:type="dxa" w:w="140"/>
+            </w:tcMar>
+          </w:tcPr>
+          <w:p>
+            <w:r>
+              <w:rPr>
+                <w:rFonts w:ascii="Georgia" w:cs="Georgia" w:eastAsia="Georgia" w:hAnsi="Georgia"/>
+                <w:color w:val="0F172A"/>
+                <w:sz w:val="20"/>
+                <w:szCs w:val="20"/>
+              </w:rPr>
               <w:t xml:space="preserve">API key rotation runbook</w:t>
             </w:r>
           </w:p>
@@ -15796,6 +16934,164 @@
                 <w:szCs w:val="20"/>
               </w:rPr>
               <w:t xml:space="preserve">technical-side complete; pending Tarry-side UAT</w:t>
+            </w:r>
+          </w:p>
+        </w:tc>
+      </w:tr>
+      <w:tr>
+        <w:tc>
+          <w:tcPr>
+            <w:tcW w:type="dxa" w:w="3370"/>
+            <w:tcBorders>
+              <w:top w:val="single" w:color="CBD5E1" w:sz="4"/>
+              <w:left w:val="single" w:color="CBD5E1" w:sz="4"/>
+              <w:bottom w:val="single" w:color="CBD5E1" w:sz="4"/>
+              <w:right w:val="single" w:color="CBD5E1" w:sz="4"/>
+            </w:tcBorders>
+            <w:tcMar>
+              <w:top w:type="dxa" w:w="80"/>
+              <w:left w:type="dxa" w:w="140"/>
+              <w:bottom w:type="dxa" w:w="80"/>
+              <w:right w:type="dxa" w:w="140"/>
+            </w:tcMar>
+          </w:tcPr>
+          <w:p>
+            <w:r>
+              <w:rPr>
+                <w:rFonts w:ascii="Georgia" w:cs="Georgia" w:eastAsia="Georgia" w:hAnsi="Georgia"/>
+                <w:color w:val="0F172A"/>
+                <w:sz w:val="20"/>
+                <w:szCs w:val="20"/>
+              </w:rPr>
+              <w:t xml:space="preserve">Sprint 5 — AI-rendered hero images</w:t>
+            </w:r>
+          </w:p>
+        </w:tc>
+        <w:tc>
+          <w:tcPr>
+            <w:tcW w:type="dxa" w:w="4305"/>
+            <w:tcBorders>
+              <w:top w:val="single" w:color="CBD5E1" w:sz="4"/>
+              <w:left w:val="single" w:color="CBD5E1" w:sz="4"/>
+              <w:bottom w:val="single" w:color="CBD5E1" w:sz="4"/>
+              <w:right w:val="single" w:color="CBD5E1" w:sz="4"/>
+            </w:tcBorders>
+            <w:tcMar>
+              <w:top w:type="dxa" w:w="80"/>
+              <w:left w:type="dxa" w:w="140"/>
+              <w:bottom w:type="dxa" w:w="80"/>
+              <w:right w:type="dxa" w:w="140"/>
+            </w:tcMar>
+          </w:tcPr>
+          <w:p>
+            <w:r>
+              <w:rPr>
+                <w:rFonts w:ascii="Georgia" w:cs="Georgia" w:eastAsia="Georgia" w:hAnsi="Georgia"/>
+                <w:color w:val="0F172A"/>
+                <w:sz w:val="20"/>
+                <w:szCs w:val="20"/>
+              </w:rPr>
+              <w:t xml:space="preserve">code-complete 2026-05-14 — 4 commits on </w:t>
+            </w:r>
+            <w:r>
+              <w:rPr>
+                <w:rFonts w:ascii="Menlo" w:cs="Menlo" w:eastAsia="Menlo" w:hAnsi="Menlo"/>
+                <w:color w:val="B45309"/>
+                <w:sz w:val="20"/>
+                <w:szCs w:val="20"/>
+              </w:rPr>
+              <w:t xml:space="preserve">claude/sprint-5</w:t>
+            </w:r>
+            <w:r>
+              <w:rPr>
+                <w:rFonts w:ascii="Georgia" w:cs="Georgia" w:eastAsia="Georgia" w:hAnsi="Georgia"/>
+                <w:color w:val="0F172A"/>
+                <w:sz w:val="20"/>
+                <w:szCs w:val="20"/>
+              </w:rPr>
+              <w:t xml:space="preserve">; aiHeroPrompt + Replicate FLUX schnell adapter + chained </w:t>
+            </w:r>
+            <w:r>
+              <w:rPr>
+                <w:rFonts w:ascii="Menlo" w:cs="Menlo" w:eastAsia="Menlo" w:hAnsi="Menlo"/>
+                <w:color w:val="B45309"/>
+                <w:sz w:val="20"/>
+                <w:szCs w:val="20"/>
+              </w:rPr>
+              <w:t xml:space="preserve">POST /api/studio/ai/hero</w:t>
+            </w:r>
+            <w:r>
+              <w:rPr>
+                <w:rFonts w:ascii="Georgia" w:cs="Georgia" w:eastAsia="Georgia" w:hAnsi="Georgia"/>
+                <w:color w:val="0F172A"/>
+                <w:sz w:val="20"/>
+                <w:szCs w:val="20"/>
+              </w:rPr>
+              <w:t xml:space="preserve"> route + Generate-hero pill with Use/Regenerate/Edit-prompt preview; </w:t>
+            </w:r>
+            <w:r>
+              <w:rPr>
+                <w:rFonts w:ascii="Menlo" w:cs="Menlo" w:eastAsia="Menlo" w:hAnsi="Menlo"/>
+                <w:color w:val="B45309"/>
+                <w:sz w:val="20"/>
+                <w:szCs w:val="20"/>
+              </w:rPr>
+              <w:t xml:space="preserve">next build</w:t>
+            </w:r>
+            <w:r>
+              <w:rPr>
+                <w:rFonts w:ascii="Georgia" w:cs="Georgia" w:eastAsia="Georgia" w:hAnsi="Georgia"/>
+                <w:color w:val="0F172A"/>
+                <w:sz w:val="20"/>
+                <w:szCs w:val="20"/>
+              </w:rPr>
+              <w:t xml:space="preserve"> green</w:t>
+            </w:r>
+          </w:p>
+        </w:tc>
+        <w:tc>
+          <w:tcPr>
+            <w:tcW w:type="dxa" w:w="1685"/>
+            <w:tcBorders>
+              <w:top w:val="single" w:color="CBD5E1" w:sz="4"/>
+              <w:left w:val="single" w:color="CBD5E1" w:sz="4"/>
+              <w:bottom w:val="single" w:color="CBD5E1" w:sz="4"/>
+              <w:right w:val="single" w:color="CBD5E1" w:sz="4"/>
+            </w:tcBorders>
+            <w:tcMar>
+              <w:top w:type="dxa" w:w="80"/>
+              <w:left w:type="dxa" w:w="140"/>
+              <w:bottom w:type="dxa" w:w="80"/>
+              <w:right w:type="dxa" w:w="140"/>
+            </w:tcMar>
+          </w:tcPr>
+          <w:p>
+            <w:r>
+              <w:rPr>
+                <w:rFonts w:ascii="Georgia" w:cs="Georgia" w:eastAsia="Georgia" w:hAnsi="Georgia"/>
+                <w:color w:val="0F172A"/>
+                <w:sz w:val="20"/>
+                <w:szCs w:val="20"/>
+              </w:rPr>
+              <w:t xml:space="preserve">technical-side complete; pending Tarry-side </w:t>
+            </w:r>
+            <w:r>
+              <w:rPr>
+                <w:rFonts w:ascii="Menlo" w:cs="Menlo" w:eastAsia="Menlo" w:hAnsi="Menlo"/>
+                <w:color w:val="B45309"/>
+                <w:sz w:val="20"/>
+                <w:szCs w:val="20"/>
+              </w:rPr>
+              <w:t xml:space="preserve">REPLICATE_API_TOKEN</w:t>
+            </w:r>
+            <w:r>
+              <w:rPr>
+                <w:rFonts w:ascii="Georgia" w:cs="Georgia" w:eastAsia="Georgia" w:hAnsi="Georgia"/>
+                <w:color w:val="0F172A"/>
+                <w:sz w:val="20"/>
+                <w:szCs w:val="20"/>
+              </w:rPr>
+              <w:t xml:space="preserve"> env + UAT</w:t>
             </w:r>
           </w:p>
         </w:tc>

</xml_diff>

<commit_message>
docs(reports): Sprint 4.5 close — theme/tags shipped + status row added
Sprint 4.5 code-complete 2026-05-14, closes SP3-08 + SP3-09.

- sprint-4-plus-roadmap.md: header date bumped; 4.5 row crossed
  out in the sequence-at-a-glance; new "Sprint 4.5 — shipped"
  section walks the three commits.
- dispatches-status-report.md: header note updated; new Sprint
  4.5 row in the sign-off table.
- Status report .docx regenerated.

Pending Tarry-side UAT: open a draft, set theme: studio + 3 tags,
publish → confirm cream-paper variant renders + tag routes resolve.

Sprint 5.5 next.

Co-Authored-By: Claude Opus 4.7 (1M context) <noreply@anthropic.com>
</commit_message>
<xml_diff>
--- a/docs/reports/dispatches-status-report.docx
+++ b/docs/reports/dispatches-status-report.docx
@@ -61,25 +61,7 @@
           <w:sz w:val="22"/>
           <w:szCs w:val="22"/>
         </w:rPr>
-        <w:t xml:space="preserve"> 2026-05-14 (Sprint 4 + Sprint 5 both code-complete — AI-suggested frontmatter · image upload · AI-rendered hero images; awaiting Tarry-side UAT + </w:t>
-      </w:r>
-      <w:r>
-        <w:rPr>
-          <w:rFonts w:ascii="Menlo" w:cs="Menlo" w:eastAsia="Menlo" w:hAnsi="Menlo"/>
-          <w:color w:val="B45309"/>
-          <w:sz w:val="20"/>
-          <w:szCs w:val="20"/>
-        </w:rPr>
-        <w:t xml:space="preserve">REPLICATE_API_TOKEN</w:t>
-      </w:r>
-      <w:r>
-        <w:rPr>
-          <w:rFonts w:ascii="Georgia" w:cs="Georgia" w:eastAsia="Georgia" w:hAnsi="Georgia"/>
-          <w:color w:val="0F172A"/>
-          <w:sz w:val="22"/>
-          <w:szCs w:val="22"/>
-        </w:rPr>
-        <w:t xml:space="preserve"> env) </w:t>
+        <w:t xml:space="preserve"> 2026-05-14 (Sprint 4 + Sprint 5 + Sprint 4.5 all code-complete; Sprint 5.5 reader-side nudges in flight) </w:t>
       </w:r>
       <w:r>
         <w:rPr>
@@ -121,7 +103,7 @@
         </w:rPr>
         <w:t xml:space="preserve"> </w:t>
       </w:r>
-      <w:hyperlink w:history="1" r:id="rIdhqkz6dda-xjpsyxno_0yl">
+      <w:hyperlink w:history="1" r:id="rIdtzg_d1s_ser3xlavbpe-j">
         <w:r>
           <w:rPr>
             <w:rFonts w:ascii="Georgia" w:cs="Georgia" w:eastAsia="Georgia" w:hAnsi="Georgia"/>
@@ -3090,7 +3072,7 @@
         </w:rPr>
         <w:t xml:space="preserve">) is live at </w:t>
       </w:r>
-      <w:hyperlink w:history="1" r:id="rIdajoiidhhor5vwdxkdwenb">
+      <w:hyperlink w:history="1" r:id="rIdmusuqs394k5rxvbafvern">
         <w:r>
           <w:rPr>
             <w:rFonts w:ascii="Georgia" w:cs="Georgia" w:eastAsia="Georgia" w:hAnsi="Georgia"/>
@@ -3437,7 +3419,7 @@
         </w:rPr>
         <w:t xml:space="preserve"> </w:t>
       </w:r>
-      <w:hyperlink w:history="1" r:id="rIdb6c0xwmn8z8mctqxmwaox">
+      <w:hyperlink w:history="1" r:id="rIdhuktmqizeuzikmpv1f8xx">
         <w:r>
           <w:rPr>
             <w:rFonts w:ascii="Georgia" w:cs="Georgia" w:eastAsia="Georgia" w:hAnsi="Georgia"/>
@@ -3458,7 +3440,7 @@
         </w:rPr>
         <w:t xml:space="preserve"> · </w:t>
       </w:r>
-      <w:hyperlink w:history="1" r:id="rIdvtwmay6fn6qge94fa56-k">
+      <w:hyperlink w:history="1" r:id="rIdayefmpfjw-1c3zg7r7fia">
         <w:r>
           <w:rPr>
             <w:rFonts w:ascii="Georgia" w:cs="Georgia" w:eastAsia="Georgia" w:hAnsi="Georgia"/>
@@ -3590,7 +3572,7 @@
         </w:rPr>
         <w:t xml:space="preserve">These items are sequenced and sized in </w:t>
       </w:r>
-      <w:hyperlink w:history="1" r:id="rIdyp3yyiyj8wwg_vuzjlw9x">
+      <w:hyperlink w:history="1" r:id="rId_x72sulwb4artfhqqormu">
         <w:r>
           <w:rPr>
             <w:rFonts w:ascii="Georgia" w:cs="Georgia" w:eastAsia="Georgia" w:hAnsi="Georgia"/>
@@ -4131,7 +4113,7 @@
         </w:rPr>
         <w:t xml:space="preserve"> </w:t>
       </w:r>
-      <w:hyperlink w:history="1" r:id="rIdty7c33ht7oy9mow05voda">
+      <w:hyperlink w:history="1" r:id="rIdt5zdv6o1bwsetjwjyqhaa">
         <w:r>
           <w:rPr>
             <w:rFonts w:ascii="Georgia" w:cs="Georgia" w:eastAsia="Georgia" w:hAnsi="Georgia"/>
@@ -17092,6 +17074,155 @@
                 <w:szCs w:val="20"/>
               </w:rPr>
               <w:t xml:space="preserve"> env + UAT</w:t>
+            </w:r>
+          </w:p>
+        </w:tc>
+      </w:tr>
+      <w:tr>
+        <w:tc>
+          <w:tcPr>
+            <w:tcW w:type="dxa" w:w="3370"/>
+            <w:tcBorders>
+              <w:top w:val="single" w:color="CBD5E1" w:sz="4"/>
+              <w:left w:val="single" w:color="CBD5E1" w:sz="4"/>
+              <w:bottom w:val="single" w:color="CBD5E1" w:sz="4"/>
+              <w:right w:val="single" w:color="CBD5E1" w:sz="4"/>
+            </w:tcBorders>
+            <w:tcMar>
+              <w:top w:type="dxa" w:w="80"/>
+              <w:left w:type="dxa" w:w="140"/>
+              <w:bottom w:type="dxa" w:w="80"/>
+              <w:right w:type="dxa" w:w="140"/>
+            </w:tcMar>
+          </w:tcPr>
+          <w:p>
+            <w:r>
+              <w:rPr>
+                <w:rFonts w:ascii="Georgia" w:cs="Georgia" w:eastAsia="Georgia" w:hAnsi="Georgia"/>
+                <w:color w:val="0F172A"/>
+                <w:sz w:val="20"/>
+                <w:szCs w:val="20"/>
+              </w:rPr>
+              <w:t xml:space="preserve">Sprint 4.5 — </w:t>
+            </w:r>
+            <w:r>
+              <w:rPr>
+                <w:rFonts w:ascii="Menlo" w:cs="Menlo" w:eastAsia="Menlo" w:hAnsi="Menlo"/>
+                <w:color w:val="B45309"/>
+                <w:sz w:val="20"/>
+                <w:szCs w:val="20"/>
+              </w:rPr>
+              <w:t xml:space="preserve">theme: studio</w:t>
+            </w:r>
+            <w:r>
+              <w:rPr>
+                <w:rFonts w:ascii="Georgia" w:cs="Georgia" w:eastAsia="Georgia" w:hAnsi="Georgia"/>
+                <w:color w:val="0F172A"/>
+                <w:sz w:val="20"/>
+                <w:szCs w:val="20"/>
+              </w:rPr>
+              <w:t xml:space="preserve"> variant + tags surface</w:t>
+            </w:r>
+          </w:p>
+        </w:tc>
+        <w:tc>
+          <w:tcPr>
+            <w:tcW w:type="dxa" w:w="4305"/>
+            <w:tcBorders>
+              <w:top w:val="single" w:color="CBD5E1" w:sz="4"/>
+              <w:left w:val="single" w:color="CBD5E1" w:sz="4"/>
+              <w:bottom w:val="single" w:color="CBD5E1" w:sz="4"/>
+              <w:right w:val="single" w:color="CBD5E1" w:sz="4"/>
+            </w:tcBorders>
+            <w:tcMar>
+              <w:top w:type="dxa" w:w="80"/>
+              <w:left w:type="dxa" w:w="140"/>
+              <w:bottom w:type="dxa" w:w="80"/>
+              <w:right w:type="dxa" w:w="140"/>
+            </w:tcMar>
+          </w:tcPr>
+          <w:p>
+            <w:r>
+              <w:rPr>
+                <w:rFonts w:ascii="Georgia" w:cs="Georgia" w:eastAsia="Georgia" w:hAnsi="Georgia"/>
+                <w:color w:val="0F172A"/>
+                <w:sz w:val="20"/>
+                <w:szCs w:val="20"/>
+              </w:rPr>
+              <w:t xml:space="preserve">code-complete 2026-05-14 — 3 commits on </w:t>
+            </w:r>
+            <w:r>
+              <w:rPr>
+                <w:rFonts w:ascii="Menlo" w:cs="Menlo" w:eastAsia="Menlo" w:hAnsi="Menlo"/>
+                <w:color w:val="B45309"/>
+                <w:sz w:val="20"/>
+                <w:szCs w:val="20"/>
+              </w:rPr>
+              <w:t xml:space="preserve">claude/sprint-4.5</w:t>
+            </w:r>
+            <w:r>
+              <w:rPr>
+                <w:rFonts w:ascii="Georgia" w:cs="Georgia" w:eastAsia="Georgia" w:hAnsi="Georgia"/>
+                <w:color w:val="0F172A"/>
+                <w:sz w:val="20"/>
+                <w:szCs w:val="20"/>
+              </w:rPr>
+              <w:t xml:space="preserve">; closes SP3-08 (theme palette) + SP3-09 (tags row + /blog/tag/</w:t>
+            </w:r>
+            <w:r>
+              <w:rPr>
+                <w:rFonts w:ascii="Georgia" w:cs="Georgia" w:eastAsia="Georgia" w:hAnsi="Georgia"/>
+                <w:color w:val="0F172A"/>
+                <w:sz w:val="20"/>
+                <w:szCs w:val="20"/>
+              </w:rPr>
+              <w:t xml:space="preserve">[tag] index + sitemap); </w:t>
+            </w:r>
+            <w:r>
+              <w:rPr>
+                <w:rFonts w:ascii="Menlo" w:cs="Menlo" w:eastAsia="Menlo" w:hAnsi="Menlo"/>
+                <w:color w:val="B45309"/>
+                <w:sz w:val="20"/>
+                <w:szCs w:val="20"/>
+              </w:rPr>
+              <w:t xml:space="preserve">next build</w:t>
+            </w:r>
+            <w:r>
+              <w:rPr>
+                <w:rFonts w:ascii="Georgia" w:cs="Georgia" w:eastAsia="Georgia" w:hAnsi="Georgia"/>
+                <w:color w:val="0F172A"/>
+                <w:sz w:val="20"/>
+                <w:szCs w:val="20"/>
+              </w:rPr>
+              <w:t xml:space="preserve"> green with 3 tag routes statically generated</w:t>
+            </w:r>
+          </w:p>
+        </w:tc>
+        <w:tc>
+          <w:tcPr>
+            <w:tcW w:type="dxa" w:w="1685"/>
+            <w:tcBorders>
+              <w:top w:val="single" w:color="CBD5E1" w:sz="4"/>
+              <w:left w:val="single" w:color="CBD5E1" w:sz="4"/>
+              <w:bottom w:val="single" w:color="CBD5E1" w:sz="4"/>
+              <w:right w:val="single" w:color="CBD5E1" w:sz="4"/>
+            </w:tcBorders>
+            <w:tcMar>
+              <w:top w:type="dxa" w:w="80"/>
+              <w:left w:type="dxa" w:w="140"/>
+              <w:bottom w:type="dxa" w:w="80"/>
+              <w:right w:type="dxa" w:w="140"/>
+            </w:tcMar>
+          </w:tcPr>
+          <w:p>
+            <w:r>
+              <w:rPr>
+                <w:rFonts w:ascii="Georgia" w:cs="Georgia" w:eastAsia="Georgia" w:hAnsi="Georgia"/>
+                <w:color w:val="0F172A"/>
+                <w:sz w:val="20"/>
+                <w:szCs w:val="20"/>
+              </w:rPr>
+              <w:t xml:space="preserve">technical-side complete; pending Tarry-side UAT</w:t>
             </w:r>
           </w:p>
         </w:tc>

</xml_diff>